<commit_message>
REGEL0 Schwaeche 4: das eigene Normal verlangt 12 Monate - junge Assets (12 von 28 der Hebel-Liste) ohne Signal im ersten Jahr; Kandidat J (Marktnormal); Liste nicht aktuell (Nutzer); Word nachgezogen
Co-Authored-By: Claude Opus 5.5 <noreply@anthropic.com>
</commit_message>
<xml_diff>
--- a/Basisinfos/REGEL0_Hebel_Entwurf_30_09.docx
+++ b/Basisinfos/REGEL0_Hebel_Entwurf_30_09.docx
@@ -2604,6 +2604,162 @@
                 <w:sz w:val="18"/>
               </w:rPr>
               <w:t xml:space="preserve"> Kern stabilisieren (M1-3)</w:t>
+            </w:r>
+          </w:p>
+        </w:tc>
+      </w:tr>
+      <w:tr>
+        <w:tc>
+          <w:tcPr>
+            <w:tcW w:type="dxa" w:w="3324"/>
+          </w:tcPr>
+          <w:p>
+            <w:r>
+              <w:rPr>
+                <w:sz w:val="18"/>
+              </w:rPr>
+            </w:r>
+            <w:r>
+              <w:rPr>
+                <w:sz w:val="18"/>
+              </w:rPr>
+              <w:t>4</w:t>
+            </w:r>
+          </w:p>
+        </w:tc>
+        <w:tc>
+          <w:tcPr>
+            <w:tcW w:type="dxa" w:w="3324"/>
+          </w:tcPr>
+          <w:p>
+            <w:r>
+              <w:rPr>
+                <w:sz w:val="18"/>
+              </w:rPr>
+            </w:r>
+            <w:r>
+              <w:rPr>
+                <w:sz w:val="18"/>
+              </w:rPr>
+              <w:t xml:space="preserve">⭐ </w:t>
+            </w:r>
+            <w:r>
+              <w:rPr>
+                <w:b/>
+                <w:sz w:val="18"/>
+              </w:rPr>
+              <w:t>Mindesthistorie 12 Monate</w:t>
+            </w:r>
+            <w:r>
+              <w:rPr>
+                <w:sz w:val="18"/>
+              </w:rPr>
+              <w:t xml:space="preserve"> für das eigene Normal (</w:t>
+            </w:r>
+            <w:r>
+              <w:rPr>
+                <w:rFonts w:ascii="Consolas" w:hAnsi="Consolas"/>
+                <w:color w:val="553388"/>
+                <w:sz w:val="18"/>
+              </w:rPr>
+              <w:t>JAHR_H = 8760</w:t>
+            </w:r>
+            <w:r>
+              <w:rPr>
+                <w:sz w:val="18"/>
+              </w:rPr>
+              <w:t xml:space="preserve">, im Code </w:t>
+            </w:r>
+            <w:r>
+              <w:rPr>
+                <w:rFonts w:ascii="Consolas" w:hAnsi="Consolas"/>
+                <w:color w:val="553388"/>
+                <w:sz w:val="18"/>
+              </w:rPr>
+              <w:t>normal()</w:t>
+            </w:r>
+            <w:r>
+              <w:rPr>
+                <w:sz w:val="18"/>
+              </w:rPr>
+              <w:t xml:space="preserve">). Junge Assets bekommen im </w:t>
+            </w:r>
+            <w:r>
+              <w:rPr>
+                <w:b/>
+                <w:sz w:val="18"/>
+              </w:rPr>
+              <w:t>ersten Jahr kein Signal</w:t>
+            </w:r>
+            <w:r>
+              <w:rPr>
+                <w:sz w:val="18"/>
+              </w:rPr>
+              <w:t xml:space="preserve">, obwohl rsi, Ruhe und ATR nur Tage brauchen. Auf der Hebel-Liste sind </w:t>
+            </w:r>
+            <w:r>
+              <w:rPr>
+                <w:b/>
+                <w:sz w:val="18"/>
+              </w:rPr>
+              <w:t>12 von 28</w:t>
+            </w:r>
+            <w:r>
+              <w:rPr>
+                <w:sz w:val="18"/>
+              </w:rPr>
+              <w:t xml:space="preserve"> Assets jung (TAO, ONDO, RENDER, MORPHO, KAIA, S, W, BIO, TURBO, IO, VIRTUAL, KAITO). Nutzer 30.09.: </w:t>
+            </w:r>
+            <w:r>
+              <w:rPr>
+                <w:i/>
+                <w:sz w:val="18"/>
+              </w:rPr>
+              <w:t>„Das System braucht keine Historie, um bei der Prüfung den Einstieg zu bewerten, oder?“</w:t>
+            </w:r>
+            <w:r>
+              <w:rPr>
+                <w:sz w:val="18"/>
+              </w:rPr>
+              <w:t xml:space="preserve"> (vgl. 2.610)</w:t>
+            </w:r>
+          </w:p>
+        </w:tc>
+        <w:tc>
+          <w:tcPr>
+            <w:tcW w:type="dxa" w:w="3324"/>
+          </w:tcPr>
+          <w:p>
+            <w:r>
+              <w:rPr>
+                <w:sz w:val="18"/>
+              </w:rPr>
+            </w:r>
+            <w:r>
+              <w:rPr>
+                <w:b/>
+                <w:sz w:val="18"/>
+              </w:rPr>
+              <w:t>J</w:t>
+            </w:r>
+            <w:r>
+              <w:rPr>
+                <w:sz w:val="18"/>
+              </w:rPr>
+              <w:t xml:space="preserve"> junge Assets: das Normal anfangs aus dem </w:t>
+            </w:r>
+            <w:r>
+              <w:rPr>
+                <w:b/>
+                <w:sz w:val="18"/>
+              </w:rPr>
+              <w:t>Markt</w:t>
+            </w:r>
+            <w:r>
+              <w:rPr>
+                <w:sz w:val="18"/>
+              </w:rPr>
+              <w:t>, mit wachsender eigener Historie überblendet (die Schrumpfung gibt es schon), gemessen gegen REGEL0</w:t>
             </w:r>
           </w:p>
         </w:tc>

</xml_diff>

<commit_message>
REGEL0: Mindesthistorie 12 Monate als SHOWSTOPPER (Nutzer) - vor der Festschreibung beheben; Loesungsweg ueber die bestehende Schrumpfung, reife Assets bitgleich; Hebel-Liste unveraendert, Spot-Zugaenge notiert
Co-Authored-By: Claude Opus 5.5 <noreply@anthropic.com>
</commit_message>
<xml_diff>
--- a/Basisinfos/REGEL0_Hebel_Entwurf_30_09.docx
+++ b/Basisinfos/REGEL0_Hebel_Entwurf_30_09.docx
@@ -2641,7 +2641,20 @@
               <w:rPr>
                 <w:sz w:val="18"/>
               </w:rPr>
-              <w:t xml:space="preserve">⭐ </w:t>
+              <w:t xml:space="preserve">⛔ </w:t>
+            </w:r>
+            <w:r>
+              <w:rPr>
+                <w:b/>
+                <w:sz w:val="18"/>
+              </w:rPr>
+              <w:t>SHOWSTOPPER (Nutzer 30.09.), nicht nur Schwäche:</w:t>
+            </w:r>
+            <w:r>
+              <w:rPr>
+                <w:sz w:val="18"/>
+              </w:rPr>
+              <w:t xml:space="preserve"> </w:t>
             </w:r>
             <w:r>
               <w:rPr>
@@ -2897,6 +2910,448 @@
         <w:t>C Vorwärtstest ab 2026-09 (die Regel K_IG &lt; 1 bleibt eingefroren, aber kein laufender Prüfauftrag) · D neue Datenquellen · E Börse/Kosten.</w:t>
       </w:r>
     </w:p>
+    <w:p>
+      <w:r>
+        <w:rPr>
+          <w:color w:val="AAAAAA"/>
+        </w:rPr>
+        <w:t>____________________________________________________________</w:t>
+      </w:r>
+    </w:p>
+    <w:p>
+      <w:pPr>
+        <w:pStyle w:val="Heading2"/>
+      </w:pPr>
+      <w:r>
+        <w:t>8. ⛔ SHOWSTOPPER vor der Festschreibung — die Mindesthistorie (Nutzer 30.09.)</w:t>
+      </w:r>
+    </w:p>
+    <w:p>
+      <w:r>
+        <w:rPr>
+          <w:b/>
+        </w:rPr>
+        <w:t>Nutzer:</w:t>
+      </w:r>
+      <w:r>
+        <w:t xml:space="preserve"> </w:t>
+      </w:r>
+      <w:r>
+        <w:rPr>
+          <w:i/>
+        </w:rPr>
+        <w:t>„Die erforderliche Mindesthistorie ist eigentlich ein Showstopper und keine Schwäche, finde ich, und war so nicht geplant und gewünscht, vor allem wenn man unsere Datenlage berücksichtigt."</w:t>
+      </w:r>
+    </w:p>
+    <w:p>
+      <w:r>
+        <w:t xml:space="preserve">➤ </w:t>
+      </w:r>
+      <w:r>
+        <w:rPr>
+          <w:b/>
+        </w:rPr>
+        <w:t>Folge:</w:t>
+      </w:r>
+      <w:r>
+        <w:t xml:space="preserve"> REGEL0 wird </w:t>
+      </w:r>
+      <w:r>
+        <w:rPr>
+          <w:b/>
+        </w:rPr>
+        <w:t>erst nach der Behebung</w:t>
+      </w:r>
+      <w:r>
+        <w:t xml:space="preserve"> festgeschrieben. Die 12-Monats-Bedingung ist kein </w:t>
+      </w:r>
+      <w:r>
+        <w:rPr>
+          <w:i/>
+        </w:rPr>
+        <w:t>korrekter Parameter</w:t>
+      </w:r>
+      <w:r>
+        <w:t xml:space="preserve"> (E-33), denn sie widerspricht der Grundanforderung </w:t>
+      </w:r>
+      <w:r>
+        <w:rPr>
+          <w:i/>
+        </w:rPr>
+        <w:t>„muss auch bei nur EINEM Asset funktionieren“</w:t>
+      </w:r>
+      <w:r>
+        <w:t xml:space="preserve"> (2.608) und </w:t>
+      </w:r>
+      <w:r>
+        <w:rPr>
+          <w:i/>
+        </w:rPr>
+        <w:t>„10 Tage Historie, nicht Jahre“</w:t>
+      </w:r>
+      <w:r>
+        <w:t xml:space="preserve"> (2.610).</w:t>
+      </w:r>
+    </w:p>
+    <w:p>
+      <w:r>
+        <w:rPr>
+          <w:b/>
+        </w:rPr>
+        <w:t>Wo sie sitzt (Code):</w:t>
+      </w:r>
+      <w:r>
+        <w:t xml:space="preserve"> </w:t>
+      </w:r>
+      <w:r>
+        <w:rPr>
+          <w:rFonts w:ascii="Consolas" w:hAnsi="Consolas"/>
+          <w:color w:val="553388"/>
+          <w:sz w:val="18"/>
+        </w:rPr>
+        <w:t>normal()</w:t>
+      </w:r>
+      <w:r>
+        <w:t xml:space="preserve"> verlangt </w:t>
+      </w:r>
+      <w:r>
+        <w:rPr>
+          <w:rFonts w:ascii="Consolas" w:hAnsi="Consolas"/>
+          <w:color w:val="553388"/>
+          <w:sz w:val="18"/>
+        </w:rPr>
+        <w:t>st - st[0] &gt;= JAHR_H</w:t>
+      </w:r>
+      <w:r>
+        <w:t xml:space="preserve"> (8.760 h) und mehr als 1.000 Stunden. Ohne das gibt es kein eigenes Normal, also kein QSh, kein v̂, kein Signal.</w:t>
+      </w:r>
+    </w:p>
+    <w:p>
+      <w:r>
+        <w:rPr>
+          <w:b/>
+        </w:rPr>
+        <w:t>Lösungsweg — auf dem Bestehenden, ohne neue Zahl:</w:t>
+      </w:r>
+    </w:p>
+    <w:tbl>
+      <w:tblPr>
+        <w:tblStyle w:val="LightGrid-Accent1"/>
+        <w:tblW w:type="auto" w:w="0"/>
+        <w:jc w:val="left"/>
+        <w:tblLook w:firstColumn="1" w:firstRow="1" w:lastColumn="0" w:lastRow="0" w:noHBand="0" w:noVBand="1" w:val="04A0"/>
+      </w:tblPr>
+      <w:tblGrid>
+        <w:gridCol w:w="4986"/>
+        <w:gridCol w:w="4986"/>
+      </w:tblGrid>
+      <w:tr>
+        <w:tc>
+          <w:tcPr>
+            <w:tcW w:type="dxa" w:w="4986"/>
+          </w:tcPr>
+          <w:p>
+            <w:r>
+              <w:rPr>
+                <w:sz w:val="18"/>
+              </w:rPr>
+            </w:r>
+            <w:r>
+              <w:rPr>
+                <w:b/>
+                <w:sz w:val="18"/>
+              </w:rPr>
+              <w:t>Schrumpfung (besteht)</w:t>
+            </w:r>
+          </w:p>
+        </w:tc>
+        <w:tc>
+          <w:tcPr>
+            <w:tcW w:type="dxa" w:w="4986"/>
+          </w:tcPr>
+          <w:p>
+            <w:r>
+              <w:rPr>
+                <w:sz w:val="18"/>
+              </w:rPr>
+            </w:r>
+            <w:r>
+              <w:rPr>
+                <w:b/>
+                <w:sz w:val="18"/>
+              </w:rPr>
+              <w:t xml:space="preserve">je Monat QSh = Marktmitte + B × (eigenes Normal − Marktmitte), mit B = τ² / (τ² + Rauschen). Je weniger eigene Ereignisse, desto mehr Rauschen und desto näher an der </w:t>
+            </w:r>
+            <w:r>
+              <w:rPr>
+                <w:b/>
+                <w:sz w:val="18"/>
+              </w:rPr>
+              <w:t>Marktmitte</w:t>
+            </w:r>
+          </w:p>
+        </w:tc>
+      </w:tr>
+      <w:tr>
+        <w:tc>
+          <w:tcPr>
+            <w:tcW w:type="dxa" w:w="4986"/>
+          </w:tcPr>
+          <w:p>
+            <w:r>
+              <w:rPr>
+                <w:sz w:val="18"/>
+              </w:rPr>
+            </w:r>
+            <w:r>
+              <w:rPr>
+                <w:b/>
+                <w:sz w:val="18"/>
+              </w:rPr>
+              <w:t>Änderung</w:t>
+            </w:r>
+          </w:p>
+        </w:tc>
+        <w:tc>
+          <w:tcPr>
+            <w:tcW w:type="dxa" w:w="4986"/>
+          </w:tcPr>
+          <w:p>
+            <w:r>
+              <w:rPr>
+                <w:sz w:val="18"/>
+              </w:rPr>
+            </w:r>
+            <w:r>
+              <w:rPr>
+                <w:sz w:val="18"/>
+              </w:rPr>
+              <w:t xml:space="preserve">Das eigene Normal wird aus der </w:t>
+            </w:r>
+            <w:r>
+              <w:rPr>
+                <w:b/>
+                <w:sz w:val="18"/>
+              </w:rPr>
+              <w:t>vorhandenen</w:t>
+            </w:r>
+            <w:r>
+              <w:rPr>
+                <w:sz w:val="18"/>
+              </w:rPr>
+              <w:t xml:space="preserve"> Historie gerechnet (höchstens 12 Monate). Das Rauschen wird aus der </w:t>
+            </w:r>
+            <w:r>
+              <w:rPr>
+                <w:b/>
+                <w:sz w:val="18"/>
+              </w:rPr>
+              <w:t>tatsächlichen</w:t>
+            </w:r>
+            <w:r>
+              <w:rPr>
+                <w:sz w:val="18"/>
+              </w:rPr>
+              <w:t xml:space="preserve"> Zahl eigener Ereignisse bestimmt. Ohne eigene Historie ist QSh = Marktmitte. Ein junges Asset startet so auf dem </w:t>
+            </w:r>
+            <w:r>
+              <w:rPr>
+                <w:b/>
+                <w:sz w:val="18"/>
+              </w:rPr>
+              <w:t>Marktnormal</w:t>
+            </w:r>
+            <w:r>
+              <w:rPr>
+                <w:sz w:val="18"/>
+              </w:rPr>
+              <w:t xml:space="preserve"> und wächst mit seiner Historie hinein</w:t>
+            </w:r>
+          </w:p>
+        </w:tc>
+      </w:tr>
+      <w:tr>
+        <w:tc>
+          <w:tcPr>
+            <w:tcW w:type="dxa" w:w="4986"/>
+          </w:tcPr>
+          <w:p>
+            <w:r>
+              <w:rPr>
+                <w:sz w:val="18"/>
+              </w:rPr>
+            </w:r>
+            <w:r>
+              <w:rPr>
+                <w:sz w:val="18"/>
+              </w:rPr>
+              <w:t>Mindesthistorie danach</w:t>
+            </w:r>
+          </w:p>
+        </w:tc>
+        <w:tc>
+          <w:tcPr>
+            <w:tcW w:type="dxa" w:w="4986"/>
+          </w:tcPr>
+          <w:p>
+            <w:r>
+              <w:rPr>
+                <w:sz w:val="18"/>
+              </w:rPr>
+            </w:r>
+            <w:r>
+              <w:rPr>
+                <w:sz w:val="18"/>
+              </w:rPr>
+              <w:t xml:space="preserve">nur noch, was das </w:t>
+            </w:r>
+            <w:r>
+              <w:rPr>
+                <w:b/>
+                <w:sz w:val="18"/>
+              </w:rPr>
+              <w:t>Signal</w:t>
+            </w:r>
+            <w:r>
+              <w:rPr>
+                <w:sz w:val="18"/>
+              </w:rPr>
+              <w:t xml:space="preserve"> braucht: rsi-Monatsabstand (10 Tage), ATR (etwa 14 Tage). Abgeleitet, nicht gewählt</w:t>
+            </w:r>
+          </w:p>
+        </w:tc>
+      </w:tr>
+      <w:tr>
+        <w:tc>
+          <w:tcPr>
+            <w:tcW w:type="dxa" w:w="4986"/>
+          </w:tcPr>
+          <w:p>
+            <w:r>
+              <w:rPr>
+                <w:sz w:val="18"/>
+              </w:rPr>
+            </w:r>
+            <w:r>
+              <w:rPr>
+                <w:b/>
+                <w:sz w:val="18"/>
+              </w:rPr>
+              <w:t>R-R11</w:t>
+            </w:r>
+          </w:p>
+        </w:tc>
+        <w:tc>
+          <w:tcPr>
+            <w:tcW w:type="dxa" w:w="4986"/>
+          </w:tcPr>
+          <w:p>
+            <w:r>
+              <w:rPr>
+                <w:sz w:val="18"/>
+              </w:rPr>
+            </w:r>
+            <w:r>
+              <w:rPr>
+                <w:sz w:val="18"/>
+              </w:rPr>
+              <w:t xml:space="preserve">Marktmitte, τ² und das rsi-Modell werden weiter </w:t>
+            </w:r>
+            <w:r>
+              <w:rPr>
+                <w:b/>
+                <w:sz w:val="18"/>
+              </w:rPr>
+              <w:t>nur aus den reifen Assets</w:t>
+            </w:r>
+            <w:r>
+              <w:rPr>
+                <w:sz w:val="18"/>
+              </w:rPr>
+              <w:t xml:space="preserve"> geschätzt. Für Assets mit ≥ 12 Monaten ändert sich damit </w:t>
+            </w:r>
+            <w:r>
+              <w:rPr>
+                <w:b/>
+                <w:sz w:val="18"/>
+              </w:rPr>
+              <w:t>nichts</w:t>
+            </w:r>
+            <w:r>
+              <w:rPr>
+                <w:sz w:val="18"/>
+              </w:rPr>
+              <w:t xml:space="preserve">, und die Referenzzahlen der REGEL0 bleiben bitgleich. Junge Assets kommen </w:t>
+            </w:r>
+            <w:r>
+              <w:rPr>
+                <w:b/>
+                <w:sz w:val="18"/>
+              </w:rPr>
+              <w:t>zusätzlich</w:t>
+            </w:r>
+            <w:r>
+              <w:rPr>
+                <w:sz w:val="18"/>
+              </w:rPr>
+              <w:t xml:space="preserve"> hinzu</w:t>
+            </w:r>
+          </w:p>
+        </w:tc>
+      </w:tr>
+      <w:tr>
+        <w:tc>
+          <w:tcPr>
+            <w:tcW w:type="dxa" w:w="4986"/>
+          </w:tcPr>
+          <w:p>
+            <w:r>
+              <w:rPr>
+                <w:sz w:val="18"/>
+              </w:rPr>
+            </w:r>
+            <w:r>
+              <w:rPr>
+                <w:sz w:val="18"/>
+              </w:rPr>
+              <w:t>Messung</w:t>
+            </w:r>
+          </w:p>
+        </w:tc>
+        <w:tc>
+          <w:tcPr>
+            <w:tcW w:type="dxa" w:w="4986"/>
+          </w:tcPr>
+          <w:p>
+            <w:r>
+              <w:rPr>
+                <w:sz w:val="18"/>
+              </w:rPr>
+            </w:r>
+            <w:r>
+              <w:rPr>
+                <w:sz w:val="18"/>
+              </w:rPr>
+              <w:t xml:space="preserve">Kern-Einstiege junger Assets in ihrem ersten Jahr: Chance gegen ihr Normal, Spiegel, Nullwelt, je Jahr, Rohvorteil in der Simulation. </w:t>
+            </w:r>
+            <w:r>
+              <w:rPr>
+                <w:b/>
+                <w:sz w:val="18"/>
+              </w:rPr>
+              <w:t>Kriterium:</w:t>
+            </w:r>
+            <w:r>
+              <w:rPr>
+                <w:sz w:val="18"/>
+              </w:rPr>
+              <w:t xml:space="preserve"> nicht schlechter als die reifen Assets (Dq &gt; 0 in beiden Jahren, über der Nullwelt)</w:t>
+            </w:r>
+          </w:p>
+        </w:tc>
+      </w:tr>
+    </w:tbl>
+    <w:p/>
     <w:sectPr>
       <w:pgSz w:w="12240" w:h="15840"/>
       <w:pgMar w:top="1134" w:right="1134" w:bottom="1134" w:left="1134" w:header="720" w:footer="720" w:gutter="0"/>

</xml_diff>

<commit_message>
2.698 J bestanden: Showstopper Mindesthistorie behoben - junge Assets tragen ab 10 Tagen in 4/4 Mengen, Rohvorteil nicht schlechter; J Teil der REGEL0; JAHRE fuer die Wahl mit --junge korrigiert
Co-Authored-By: Claude Opus 5.5 <noreply@anthropic.com>
</commit_message>
<xml_diff>
--- a/Basisinfos/REGEL0_Hebel_Entwurf_30_09.docx
+++ b/Basisinfos/REGEL0_Hebel_Entwurf_30_09.docx
@@ -2641,20 +2641,20 @@
               <w:rPr>
                 <w:sz w:val="18"/>
               </w:rPr>
-              <w:t xml:space="preserve">⛔ </w:t>
+              <w:t xml:space="preserve">✔ </w:t>
             </w:r>
             <w:r>
               <w:rPr>
                 <w:b/>
                 <w:sz w:val="18"/>
               </w:rPr>
-              <w:t>SHOWSTOPPER (Nutzer 30.09.), nicht nur Schwäche:</w:t>
-            </w:r>
-            <w:r>
-              <w:rPr>
-                <w:sz w:val="18"/>
-              </w:rPr>
-              <w:t xml:space="preserve"> </w:t>
+              <w:t>BEHOBEN (2.698, J):</w:t>
+            </w:r>
+            <w:r>
+              <w:rPr>
+                <w:sz w:val="18"/>
+              </w:rPr>
+              <w:t xml:space="preserve"> ~~Showstopper~~ </w:t>
             </w:r>
             <w:r>
               <w:rPr>
@@ -3352,6 +3352,704 @@
       </w:tr>
     </w:tbl>
     <w:p/>
+    <w:p>
+      <w:r>
+        <w:rPr>
+          <w:color w:val="AAAAAA"/>
+        </w:rPr>
+        <w:t>____________________________________________________________</w:t>
+      </w:r>
+    </w:p>
+    <w:p>
+      <w:pPr>
+        <w:pStyle w:val="Heading2"/>
+      </w:pPr>
+      <w:r>
+        <w:t>9. ✔ J ist Teil der REGEL0 (Befund 2.698)</w:t>
+      </w:r>
+    </w:p>
+    <w:tbl>
+      <w:tblPr>
+        <w:tblStyle w:val="LightGrid-Accent1"/>
+        <w:tblW w:type="auto" w:w="0"/>
+        <w:jc w:val="left"/>
+        <w:tblLook w:firstColumn="1" w:firstRow="1" w:lastColumn="0" w:lastRow="0" w:noHBand="0" w:noVBand="1" w:val="04A0"/>
+      </w:tblPr>
+      <w:tblGrid>
+        <w:gridCol w:w="4986"/>
+        <w:gridCol w:w="4986"/>
+      </w:tblGrid>
+      <w:tr>
+        <w:tc>
+          <w:tcPr>
+            <w:tcW w:type="dxa" w:w="4986"/>
+          </w:tcPr>
+          <w:p>
+            <w:r>
+              <w:rPr>
+                <w:sz w:val="18"/>
+              </w:rPr>
+            </w:r>
+            <w:r>
+              <w:rPr>
+                <w:b/>
+                <w:sz w:val="18"/>
+              </w:rPr>
+              <w:t>Parameter</w:t>
+            </w:r>
+          </w:p>
+        </w:tc>
+        <w:tc>
+          <w:tcPr>
+            <w:tcW w:type="dxa" w:w="4986"/>
+          </w:tcPr>
+          <w:p>
+            <w:r>
+              <w:rPr>
+                <w:sz w:val="18"/>
+              </w:rPr>
+            </w:r>
+            <w:r>
+              <w:rPr>
+                <w:b/>
+                <w:sz w:val="18"/>
+              </w:rPr>
+              <w:t>REGEL0 mit J</w:t>
+            </w:r>
+          </w:p>
+        </w:tc>
+      </w:tr>
+      <w:tr>
+        <w:tc>
+          <w:tcPr>
+            <w:tcW w:type="dxa" w:w="4986"/>
+          </w:tcPr>
+          <w:p>
+            <w:r>
+              <w:rPr>
+                <w:sz w:val="18"/>
+              </w:rPr>
+            </w:r>
+            <w:r>
+              <w:rPr>
+                <w:b/>
+                <w:sz w:val="18"/>
+              </w:rPr>
+              <w:t>eigenes Normal</w:t>
+            </w:r>
+          </w:p>
+        </w:tc>
+        <w:tc>
+          <w:tcPr>
+            <w:tcW w:type="dxa" w:w="4986"/>
+          </w:tcPr>
+          <w:p>
+            <w:r>
+              <w:rPr>
+                <w:sz w:val="18"/>
+              </w:rPr>
+            </w:r>
+            <w:r>
+              <w:rPr>
+                <w:sz w:val="18"/>
+              </w:rPr>
+              <w:t xml:space="preserve">aus der </w:t>
+            </w:r>
+            <w:r>
+              <w:rPr>
+                <w:b/>
+                <w:sz w:val="18"/>
+              </w:rPr>
+              <w:t>vorhandenen</w:t>
+            </w:r>
+            <w:r>
+              <w:rPr>
+                <w:sz w:val="18"/>
+              </w:rPr>
+              <w:t xml:space="preserve"> Historie (höchstens 12 Monate), ab </w:t>
+            </w:r>
+            <w:r>
+              <w:rPr>
+                <w:b/>
+                <w:sz w:val="18"/>
+              </w:rPr>
+              <w:t>240 h</w:t>
+            </w:r>
+            <w:r>
+              <w:rPr>
+                <w:sz w:val="18"/>
+              </w:rPr>
+              <w:t>. Geschrumpft an derselben Marktmitte und τ², das Rauschen aus Rate × min(365, Tage der Historie). Ohne eigene Historie: Marktmitte</w:t>
+            </w:r>
+          </w:p>
+        </w:tc>
+      </w:tr>
+      <w:tr>
+        <w:tc>
+          <w:tcPr>
+            <w:tcW w:type="dxa" w:w="4986"/>
+          </w:tcPr>
+          <w:p>
+            <w:r>
+              <w:rPr>
+                <w:sz w:val="18"/>
+              </w:rPr>
+            </w:r>
+            <w:r>
+              <w:rPr>
+                <w:sz w:val="18"/>
+              </w:rPr>
+              <w:t>Training des rsi-Modells, Marktmitte, τ²</w:t>
+            </w:r>
+          </w:p>
+        </w:tc>
+        <w:tc>
+          <w:tcPr>
+            <w:tcW w:type="dxa" w:w="4986"/>
+          </w:tcPr>
+          <w:p>
+            <w:r>
+              <w:rPr>
+                <w:sz w:val="18"/>
+              </w:rPr>
+            </w:r>
+            <w:r>
+              <w:rPr>
+                <w:sz w:val="18"/>
+              </w:rPr>
+              <w:t xml:space="preserve">weiter </w:t>
+            </w:r>
+            <w:r>
+              <w:rPr>
+                <w:b/>
+                <w:sz w:val="18"/>
+              </w:rPr>
+              <w:t>nur aus reifen</w:t>
+            </w:r>
+            <w:r>
+              <w:rPr>
+                <w:sz w:val="18"/>
+              </w:rPr>
+              <w:t xml:space="preserve"> Stunden (≥ 12 Monate), damit bitgleich</w:t>
+            </w:r>
+          </w:p>
+        </w:tc>
+      </w:tr>
+      <w:tr>
+        <w:tc>
+          <w:tcPr>
+            <w:tcW w:type="dxa" w:w="4986"/>
+          </w:tcPr>
+          <w:p>
+            <w:r>
+              <w:rPr>
+                <w:sz w:val="18"/>
+              </w:rPr>
+            </w:r>
+            <w:r>
+              <w:rPr>
+                <w:b/>
+                <w:sz w:val="18"/>
+              </w:rPr>
+              <w:t>Mindesthistorie der Regel</w:t>
+            </w:r>
+          </w:p>
+        </w:tc>
+        <w:tc>
+          <w:tcPr>
+            <w:tcW w:type="dxa" w:w="4986"/>
+          </w:tcPr>
+          <w:p>
+            <w:r>
+              <w:rPr>
+                <w:sz w:val="18"/>
+              </w:rPr>
+            </w:r>
+            <w:r>
+              <w:rPr>
+                <w:b/>
+                <w:sz w:val="18"/>
+              </w:rPr>
+              <w:t>10 Tage</w:t>
+            </w:r>
+            <w:r>
+              <w:rPr>
+                <w:sz w:val="18"/>
+              </w:rPr>
+              <w:t xml:space="preserve"> (rsi-Monatsabstand, 240 h)</w:t>
+            </w:r>
+          </w:p>
+        </w:tc>
+      </w:tr>
+      <w:tr>
+        <w:tc>
+          <w:tcPr>
+            <w:tcW w:type="dxa" w:w="4986"/>
+          </w:tcPr>
+          <w:p>
+            <w:r>
+              <w:rPr>
+                <w:sz w:val="18"/>
+              </w:rPr>
+            </w:r>
+            <w:r>
+              <w:rPr>
+                <w:sz w:val="18"/>
+              </w:rPr>
+              <w:t>Wirkung</w:t>
+            </w:r>
+          </w:p>
+        </w:tc>
+        <w:tc>
+          <w:tcPr>
+            <w:tcW w:type="dxa" w:w="4986"/>
+          </w:tcPr>
+          <w:p>
+            <w:r>
+              <w:rPr>
+                <w:sz w:val="18"/>
+              </w:rPr>
+            </w:r>
+            <w:r>
+              <w:rPr>
+                <w:sz w:val="18"/>
+              </w:rPr>
+              <w:t>+18–21 % Einstiege auf 72–74 zusätzlichen Assets, tragen in 4/4 Mengen</w:t>
+            </w:r>
+          </w:p>
+        </w:tc>
+      </w:tr>
+    </w:tbl>
+    <w:p/>
+    <w:p>
+      <w:r>
+        <w:rPr>
+          <w:b/>
+        </w:rPr>
+        <w:t>Referenzzahlen mit J</w:t>
+      </w:r>
+      <w:r>
+        <w:t xml:space="preserve"> (ersetzen Abschnitt 5 nach der Festschreibung):</w:t>
+      </w:r>
+    </w:p>
+    <w:tbl>
+      <w:tblPr>
+        <w:tblStyle w:val="LightGrid-Accent1"/>
+        <w:tblW w:type="auto" w:w="0"/>
+        <w:jc w:val="left"/>
+        <w:tblLook w:firstColumn="1" w:firstRow="1" w:lastColumn="0" w:lastRow="0" w:noHBand="0" w:noVBand="1" w:val="04A0"/>
+      </w:tblPr>
+      <w:tblGrid>
+        <w:gridCol w:w="1994"/>
+        <w:gridCol w:w="1994"/>
+        <w:gridCol w:w="1994"/>
+        <w:gridCol w:w="1994"/>
+        <w:gridCol w:w="1994"/>
+      </w:tblGrid>
+      <w:tr>
+        <w:tc>
+          <w:tcPr>
+            <w:tcW w:type="dxa" w:w="1994"/>
+          </w:tcPr>
+          <w:p>
+            <w:r>
+              <w:rPr>
+                <w:sz w:val="18"/>
+              </w:rPr>
+            </w:r>
+          </w:p>
+        </w:tc>
+        <w:tc>
+          <w:tcPr>
+            <w:tcW w:type="dxa" w:w="1994"/>
+          </w:tcPr>
+          <w:p>
+            <w:r>
+              <w:rPr>
+                <w:sz w:val="18"/>
+              </w:rPr>
+            </w:r>
+            <w:r>
+              <w:rPr>
+                <w:b/>
+                <w:sz w:val="18"/>
+              </w:rPr>
+              <w:t>bestand</w:t>
+            </w:r>
+          </w:p>
+        </w:tc>
+        <w:tc>
+          <w:tcPr>
+            <w:tcW w:type="dxa" w:w="1994"/>
+          </w:tcPr>
+          <w:p>
+            <w:r>
+              <w:rPr>
+                <w:sz w:val="18"/>
+              </w:rPr>
+            </w:r>
+            <w:r>
+              <w:rPr>
+                <w:b/>
+                <w:sz w:val="18"/>
+              </w:rPr>
+              <w:t>unverzerrt:1</w:t>
+            </w:r>
+          </w:p>
+        </w:tc>
+        <w:tc>
+          <w:tcPr>
+            <w:tcW w:type="dxa" w:w="1994"/>
+          </w:tcPr>
+          <w:p>
+            <w:r>
+              <w:rPr>
+                <w:sz w:val="18"/>
+              </w:rPr>
+            </w:r>
+            <w:r>
+              <w:rPr>
+                <w:b/>
+                <w:sz w:val="18"/>
+              </w:rPr>
+              <w:t>unverzerrt:2</w:t>
+            </w:r>
+          </w:p>
+        </w:tc>
+        <w:tc>
+          <w:tcPr>
+            <w:tcW w:type="dxa" w:w="1994"/>
+          </w:tcPr>
+          <w:p>
+            <w:r>
+              <w:rPr>
+                <w:sz w:val="18"/>
+              </w:rPr>
+            </w:r>
+            <w:r>
+              <w:rPr>
+                <w:b/>
+                <w:sz w:val="18"/>
+              </w:rPr>
+              <w:t>unverzerrt:3</w:t>
+            </w:r>
+          </w:p>
+        </w:tc>
+      </w:tr>
+      <w:tr>
+        <w:tc>
+          <w:tcPr>
+            <w:tcW w:type="dxa" w:w="1994"/>
+          </w:tcPr>
+          <w:p>
+            <w:r>
+              <w:rPr>
+                <w:sz w:val="18"/>
+              </w:rPr>
+            </w:r>
+            <w:r>
+              <w:rPr>
+                <w:sz w:val="18"/>
+              </w:rPr>
+              <w:t>Einstiege 2024–26</w:t>
+            </w:r>
+          </w:p>
+        </w:tc>
+        <w:tc>
+          <w:tcPr>
+            <w:tcW w:type="dxa" w:w="1994"/>
+          </w:tcPr>
+          <w:p>
+            <w:r>
+              <w:rPr>
+                <w:sz w:val="18"/>
+              </w:rPr>
+            </w:r>
+            <w:r>
+              <w:rPr>
+                <w:sz w:val="18"/>
+              </w:rPr>
+              <w:t>9.905</w:t>
+            </w:r>
+          </w:p>
+        </w:tc>
+        <w:tc>
+          <w:tcPr>
+            <w:tcW w:type="dxa" w:w="1994"/>
+          </w:tcPr>
+          <w:p>
+            <w:r>
+              <w:rPr>
+                <w:sz w:val="18"/>
+              </w:rPr>
+            </w:r>
+            <w:r>
+              <w:rPr>
+                <w:sz w:val="18"/>
+              </w:rPr>
+              <w:t>10.337</w:t>
+            </w:r>
+          </w:p>
+        </w:tc>
+        <w:tc>
+          <w:tcPr>
+            <w:tcW w:type="dxa" w:w="1994"/>
+          </w:tcPr>
+          <w:p>
+            <w:r>
+              <w:rPr>
+                <w:sz w:val="18"/>
+              </w:rPr>
+            </w:r>
+            <w:r>
+              <w:rPr>
+                <w:sz w:val="18"/>
+              </w:rPr>
+              <w:t>9.670</w:t>
+            </w:r>
+          </w:p>
+        </w:tc>
+        <w:tc>
+          <w:tcPr>
+            <w:tcW w:type="dxa" w:w="1994"/>
+          </w:tcPr>
+          <w:p>
+            <w:r>
+              <w:rPr>
+                <w:sz w:val="18"/>
+              </w:rPr>
+            </w:r>
+            <w:r>
+              <w:rPr>
+                <w:sz w:val="18"/>
+              </w:rPr>
+              <w:t>9.956</w:t>
+            </w:r>
+          </w:p>
+        </w:tc>
+      </w:tr>
+      <w:tr>
+        <w:tc>
+          <w:tcPr>
+            <w:tcW w:type="dxa" w:w="1994"/>
+          </w:tcPr>
+          <w:p>
+            <w:r>
+              <w:rPr>
+                <w:sz w:val="18"/>
+              </w:rPr>
+            </w:r>
+            <w:r>
+              <w:rPr>
+                <w:sz w:val="18"/>
+              </w:rPr>
+              <w:t>Rohvorteil je Handel 2025–26</w:t>
+            </w:r>
+          </w:p>
+        </w:tc>
+        <w:tc>
+          <w:tcPr>
+            <w:tcW w:type="dxa" w:w="1994"/>
+          </w:tcPr>
+          <w:p>
+            <w:r>
+              <w:rPr>
+                <w:sz w:val="18"/>
+              </w:rPr>
+            </w:r>
+            <w:r>
+              <w:rPr>
+                <w:sz w:val="18"/>
+              </w:rPr>
+              <w:t>+0,583 %</w:t>
+            </w:r>
+          </w:p>
+        </w:tc>
+        <w:tc>
+          <w:tcPr>
+            <w:tcW w:type="dxa" w:w="1994"/>
+          </w:tcPr>
+          <w:p>
+            <w:r>
+              <w:rPr>
+                <w:sz w:val="18"/>
+              </w:rPr>
+            </w:r>
+            <w:r>
+              <w:rPr>
+                <w:sz w:val="18"/>
+              </w:rPr>
+              <w:t>+0,324 %</w:t>
+            </w:r>
+          </w:p>
+        </w:tc>
+        <w:tc>
+          <w:tcPr>
+            <w:tcW w:type="dxa" w:w="1994"/>
+          </w:tcPr>
+          <w:p>
+            <w:r>
+              <w:rPr>
+                <w:sz w:val="18"/>
+              </w:rPr>
+            </w:r>
+            <w:r>
+              <w:rPr>
+                <w:sz w:val="18"/>
+              </w:rPr>
+              <w:t>+0,331 %</w:t>
+            </w:r>
+          </w:p>
+        </w:tc>
+        <w:tc>
+          <w:tcPr>
+            <w:tcW w:type="dxa" w:w="1994"/>
+          </w:tcPr>
+          <w:p>
+            <w:r>
+              <w:rPr>
+                <w:sz w:val="18"/>
+              </w:rPr>
+            </w:r>
+            <w:r>
+              <w:rPr>
+                <w:sz w:val="18"/>
+              </w:rPr>
+              <w:t>+0,343 %</w:t>
+            </w:r>
+          </w:p>
+        </w:tc>
+      </w:tr>
+      <w:tr>
+        <w:tc>
+          <w:tcPr>
+            <w:tcW w:type="dxa" w:w="1994"/>
+          </w:tcPr>
+          <w:p>
+            <w:r>
+              <w:rPr>
+                <w:sz w:val="18"/>
+              </w:rPr>
+            </w:r>
+            <w:r>
+              <w:rPr>
+                <w:sz w:val="18"/>
+              </w:rPr>
+              <w:t>Hebelkonto 2025–26 (log)</w:t>
+            </w:r>
+          </w:p>
+        </w:tc>
+        <w:tc>
+          <w:tcPr>
+            <w:tcW w:type="dxa" w:w="1994"/>
+          </w:tcPr>
+          <w:p>
+            <w:r>
+              <w:rPr>
+                <w:sz w:val="18"/>
+              </w:rPr>
+            </w:r>
+            <w:r>
+              <w:rPr>
+                <w:sz w:val="18"/>
+              </w:rPr>
+              <w:t>+0,2634</w:t>
+            </w:r>
+          </w:p>
+        </w:tc>
+        <w:tc>
+          <w:tcPr>
+            <w:tcW w:type="dxa" w:w="1994"/>
+          </w:tcPr>
+          <w:p>
+            <w:r>
+              <w:rPr>
+                <w:sz w:val="18"/>
+              </w:rPr>
+            </w:r>
+            <w:r>
+              <w:rPr>
+                <w:sz w:val="18"/>
+              </w:rPr>
+              <w:t>−0,4877</w:t>
+            </w:r>
+          </w:p>
+        </w:tc>
+        <w:tc>
+          <w:tcPr>
+            <w:tcW w:type="dxa" w:w="1994"/>
+          </w:tcPr>
+          <w:p>
+            <w:r>
+              <w:rPr>
+                <w:sz w:val="18"/>
+              </w:rPr>
+            </w:r>
+            <w:r>
+              <w:rPr>
+                <w:sz w:val="18"/>
+              </w:rPr>
+              <w:t>−0,4543</w:t>
+            </w:r>
+          </w:p>
+        </w:tc>
+        <w:tc>
+          <w:tcPr>
+            <w:tcW w:type="dxa" w:w="1994"/>
+          </w:tcPr>
+          <w:p>
+            <w:r>
+              <w:rPr>
+                <w:sz w:val="18"/>
+              </w:rPr>
+            </w:r>
+            <w:r>
+              <w:rPr>
+                <w:sz w:val="18"/>
+              </w:rPr>
+              <w:t>−0,4058</w:t>
+            </w:r>
+          </w:p>
+        </w:tc>
+      </w:tr>
+    </w:tbl>
+    <w:p/>
+    <w:p>
+      <w:r>
+        <w:t xml:space="preserve">Aufruf: </w:t>
+      </w:r>
+      <w:r>
+        <w:rPr>
+          <w:rFonts w:ascii="Consolas" w:hAnsi="Consolas"/>
+          <w:color w:val="553388"/>
+          <w:sz w:val="18"/>
+        </w:rPr>
+        <w:t>messe_losfahren.py --kern --ruhe 48 --junge --export 0.035</w:t>
+      </w:r>
+      <w:r>
+        <w:t xml:space="preserve"> und </w:t>
+      </w:r>
+      <w:r>
+        <w:rPr>
+          <w:rFonts w:ascii="Consolas" w:hAnsi="Consolas"/>
+          <w:color w:val="553388"/>
+          <w:sz w:val="18"/>
+        </w:rPr>
+        <w:t>messe_k6_hebelstufe.py --kurs mark --einstiege kern48j_einstiege_&lt;m&gt;.csv --simulation 24,ohne,0.02</w:t>
+      </w:r>
+      <w:r>
+        <w:t xml:space="preserve">. ⚠️ Vor der Festschreibung offen: Schritt 2 im Plan, die </w:t>
+      </w:r>
+      <w:r>
+        <w:rPr>
+          <w:b/>
+        </w:rPr>
+        <w:t>Schwellenwahl auf der vollständigen 2024-Menge</w:t>
+      </w:r>
+      <w:r>
+        <w:t>.</w:t>
+      </w:r>
+    </w:p>
     <w:sectPr>
       <w:pgSz w:w="12240" w:h="15840"/>
       <w:pgMar w:top="1134" w:right="1134" w:bottom="1134" w:left="1134" w:header="720" w:footer="720" w:gutter="0"/>

</xml_diff>

<commit_message>
2.699 Schwellenwahl auf der vollstaendigen 2024-Menge bestaetigt s = +0,035 (W0 bitgleich, W1, W2 REGEL0-Form Abstand +0,088); REGEL0 bereit zur Festschreibung; R-R11-Beschriftung korrigiert
Co-Authored-By: Claude Opus 5.5 <noreply@anthropic.com>
</commit_message>
<xml_diff>
--- a/Basisinfos/REGEL0_Hebel_Entwurf_30_09.docx
+++ b/Basisinfos/REGEL0_Hebel_Entwurf_30_09.docx
@@ -4038,16 +4038,25 @@
         <w:t>messe_k6_hebelstufe.py --kurs mark --einstiege kern48j_einstiege_&lt;m&gt;.csv --simulation 24,ohne,0.02</w:t>
       </w:r>
       <w:r>
-        <w:t xml:space="preserve">. ⚠️ Vor der Festschreibung offen: Schritt 2 im Plan, die </w:t>
+        <w:t xml:space="preserve">. ✔ Schritt 2 erledigt (2.699): Die Schwellenwahl auf der vollständigen 2024-Menge ergibt wieder </w:t>
       </w:r>
       <w:r>
         <w:rPr>
           <w:b/>
         </w:rPr>
-        <w:t>Schwellenwahl auf der vollständigen 2024-Menge</w:t>
+        <w:t>s = +0,035</w:t>
       </w:r>
       <w:r>
-        <w:t>.</w:t>
+        <w:t xml:space="preserve">, in der REGEL0-Form mit dem Abstand +0,088 gegen +0,066. </w:t>
+      </w:r>
+      <w:r>
+        <w:rPr>
+          <w:b/>
+        </w:rPr>
+        <w:t>Die REGEL0 kann festgeschrieben werden</w:t>
+      </w:r>
+      <w:r>
+        <w:t xml:space="preserve"> (Nutzer-Ja).</w:t>
       </w:r>
     </w:p>
     <w:sectPr>

</xml_diff>

<commit_message>
E-36 REGEL0 festgeschrieben: Dokument (gueltige Referenz mit J), hebel_neubau.REGEL0 mit allen Parametern und regel0_gegen_belege(); Wache Hebelneubau prueft die Referenzzahlen gegen die Belegdateien (mit Gegenprobe)
Co-Authored-By: Claude Opus 5.5 <noreply@anthropic.com>
</commit_message>
<xml_diff>
--- a/Basisinfos/REGEL0_Hebel_Entwurf_30_09.docx
+++ b/Basisinfos/REGEL0_Hebel_Entwurf_30_09.docx
@@ -7,7 +7,71 @@
         <w:pStyle w:val="Heading1"/>
       </w:pPr>
       <w:r>
-        <w:t>REGEL0 — die festgeschriebene Ausgangslage des Hebel-Neubaus (ENTWURF 30.09.2026, zur Abstimmung)</w:t>
+        <w:t>REGEL0 — die festgeschriebene Ausgangslage des Hebel-Neubaus — ✔ FESTGESCHRIEBEN 01.10.2026</w:t>
+      </w:r>
+    </w:p>
+    <w:p>
+      <w:pPr>
+        <w:pStyle w:val="IntenseQuote"/>
+      </w:pPr>
+      <w:r>
+        <w:t xml:space="preserve">⭐ </w:t>
+      </w:r>
+      <w:r>
+        <w:rPr>
+          <w:b/>
+        </w:rPr>
+        <w:t>Stand: FESTGESCHRIEBEN 01.10.2026</w:t>
+      </w:r>
+      <w:r>
+        <w:t xml:space="preserve"> (Nutzer: </w:t>
+      </w:r>
+      <w:r>
+        <w:rPr>
+          <w:i/>
+        </w:rPr>
+        <w:t>„Ja, REGEL0 festschreiben, prüfen und gegenprüfen“</w:t>
+      </w:r>
+      <w:r>
+        <w:t xml:space="preserve">, E-36), mit </w:t>
+      </w:r>
+      <w:r>
+        <w:rPr>
+          <w:b/>
+        </w:rPr>
+        <w:t>J</w:t>
+      </w:r>
+      <w:r>
+        <w:t xml:space="preserve"> (2.698) und der bestätigten </w:t>
+      </w:r>
+      <w:r>
+        <w:rPr>
+          <w:b/>
+        </w:rPr>
+        <w:t>Schwellenwahl</w:t>
+      </w:r>
+      <w:r>
+        <w:t xml:space="preserve"> (2.699). Im Code: </w:t>
+      </w:r>
+      <w:r>
+        <w:rPr>
+          <w:rFonts w:ascii="Consolas" w:hAnsi="Consolas"/>
+          <w:color w:val="553388"/>
+          <w:sz w:val="18"/>
+        </w:rPr>
+        <w:t>hebel_neubau.REGEL0</w:t>
+      </w:r>
+      <w:r>
+        <w:t xml:space="preserve">. Die Wache vergleicht die Referenzzahlen mit den Belegdateien. Der Dateiname mit </w:t>
+      </w:r>
+      <w:r>
+        <w:rPr>
+          <w:i/>
+        </w:rPr>
+        <w:t>Entwurf</w:t>
+      </w:r>
+      <w:r>
+        <w:t xml:space="preserve"> ist historisch und bleibt, damit die Verweise gelten. Entstanden als Entwurf am 30.09.2026.</w:t>
       </w:r>
     </w:p>
     <w:p>
@@ -65,16 +129,7 @@
         <w:t>gegen REGEL0</w:t>
       </w:r>
       <w:r>
-        <w:t xml:space="preserve"> gemessen (R-R11: erst REGEL0 bitgleich reproduzieren, dann ändern). ⚠️ </w:t>
-      </w:r>
-      <w:r>
-        <w:rPr>
-          <w:b/>
-        </w:rPr>
-        <w:t>Entwurf:</w:t>
-      </w:r>
-      <w:r>
-        <w:t xml:space="preserve"> Die Parameter stammen aus den Befunden. Festgeschrieben wird REGEL0 erst nach deinem Ja.</w:t>
+        <w:t xml:space="preserve"> gemessen (R-R11: erst REGEL0 bitgleich reproduzieren, dann ändern). Die Parameter stammen aus den Befunden 2.688–2.699.</w:t>
       </w:r>
     </w:p>
     <w:p>
@@ -625,7 +680,20 @@
               <w:rPr>
                 <w:sz w:val="18"/>
               </w:rPr>
-              <w:t xml:space="preserve"> neu geschätzt, Training ab 2023-01 bis Monatsbeginn −24 h</w:t>
+              <w:t xml:space="preserve"> neu geschätzt, Training ab 2023-01 bis Monatsbeginn −24 h, nur </w:t>
+            </w:r>
+            <w:r>
+              <w:rPr>
+                <w:b/>
+                <w:sz w:val="18"/>
+              </w:rPr>
+              <w:t>reife</w:t>
+            </w:r>
+            <w:r>
+              <w:rPr>
+                <w:sz w:val="18"/>
+              </w:rPr>
+              <w:t xml:space="preserve"> Stunden. ⚠️ Im Betrieb ist das ein Monatstraining am Notebook (Bauaufgabe, Schritt 7)</w:t>
             </w:r>
           </w:p>
         </w:tc>
@@ -644,6 +712,89 @@
                 <w:sz w:val="18"/>
               </w:rPr>
               <w:t>2.683/2.684, 2.688</w:t>
+            </w:r>
+          </w:p>
+        </w:tc>
+      </w:tr>
+      <w:tr>
+        <w:tc>
+          <w:tcPr>
+            <w:tcW w:type="dxa" w:w="3324"/>
+          </w:tcPr>
+          <w:p>
+            <w:r>
+              <w:rPr>
+                <w:sz w:val="18"/>
+              </w:rPr>
+            </w:r>
+            <w:r>
+              <w:rPr>
+                <w:b/>
+                <w:sz w:val="18"/>
+              </w:rPr>
+              <w:t>eigenes Normal</w:t>
+            </w:r>
+            <w:r>
+              <w:rPr>
+                <w:sz w:val="18"/>
+              </w:rPr>
+              <w:t xml:space="preserve"> (J)</w:t>
+            </w:r>
+          </w:p>
+        </w:tc>
+        <w:tc>
+          <w:tcPr>
+            <w:tcW w:type="dxa" w:w="3324"/>
+          </w:tcPr>
+          <w:p>
+            <w:r>
+              <w:rPr>
+                <w:sz w:val="18"/>
+              </w:rPr>
+            </w:r>
+            <w:r>
+              <w:rPr>
+                <w:sz w:val="18"/>
+              </w:rPr>
+              <w:t xml:space="preserve">aus der vorhandenen Historie ab </w:t>
+            </w:r>
+            <w:r>
+              <w:rPr>
+                <w:b/>
+                <w:sz w:val="18"/>
+              </w:rPr>
+              <w:t>240 h</w:t>
+            </w:r>
+            <w:r>
+              <w:rPr>
+                <w:sz w:val="18"/>
+              </w:rPr>
+              <w:t xml:space="preserve">, geschrumpft an Marktmitte und τ² der reifen Assets. </w:t>
+            </w:r>
+            <w:r>
+              <w:rPr>
+                <w:b/>
+                <w:sz w:val="18"/>
+              </w:rPr>
+              <w:t>Mindesthistorie der Regel: 10 Tage</w:t>
+            </w:r>
+          </w:p>
+        </w:tc>
+        <w:tc>
+          <w:tcPr>
+            <w:tcW w:type="dxa" w:w="3324"/>
+          </w:tcPr>
+          <w:p>
+            <w:r>
+              <w:rPr>
+                <w:sz w:val="18"/>
+              </w:rPr>
+            </w:r>
+            <w:r>
+              <w:rPr>
+                <w:sz w:val="18"/>
+              </w:rPr>
+              <w:t>2.698</w:t>
             </w:r>
           </w:p>
         </w:tc>
@@ -1883,6 +2034,14 @@
         <w:t>5. Die Referenzzahlen — REGEL0 muss sie bitgleich treffen (R-R11)</w:t>
       </w:r>
     </w:p>
+    <w:p>
+      <w:r>
+        <w:rPr>
+          <w:b/>
+        </w:rPr>
+        <w:t>✔ GÜLTIG (mit J, 2.698), von der Wache gegen `Basisinfos/J_30_09/sim__&lt;m&gt;.txt` geprüft:</w:t>
+      </w:r>
+    </w:p>
     <w:tbl>
       <w:tblPr>
         <w:tblStyle w:val="LightGrid-Accent1"/>
@@ -2002,7 +2161,7 @@
               <w:rPr>
                 <w:sz w:val="18"/>
               </w:rPr>
-              <w:t>Einstiege 2024 / 2025–26</w:t>
+              <w:t>Einstiege 2024–26 (Export)</w:t>
             </w:r>
           </w:p>
         </w:tc>
@@ -2020,7 +2179,7 @@
               <w:rPr>
                 <w:sz w:val="18"/>
               </w:rPr>
-              <w:t>1.486 / 6.328</w:t>
+              <w:t>9.905</w:t>
             </w:r>
           </w:p>
         </w:tc>
@@ -2038,7 +2197,7 @@
               <w:rPr>
                 <w:sz w:val="18"/>
               </w:rPr>
-              <w:t>– / 7.121</w:t>
+              <w:t>10.337</w:t>
             </w:r>
           </w:p>
         </w:tc>
@@ -2056,7 +2215,7 @@
               <w:rPr>
                 <w:sz w:val="18"/>
               </w:rPr>
-              <w:t>– / 6.463</w:t>
+              <w:t>9.670</w:t>
             </w:r>
           </w:p>
         </w:tc>
@@ -2074,7 +2233,7 @@
               <w:rPr>
                 <w:sz w:val="18"/>
               </w:rPr>
-              <w:t>– / 6.782</w:t>
+              <w:t>9.956</w:t>
             </w:r>
           </w:p>
         </w:tc>
@@ -2094,7 +2253,7 @@
               <w:rPr>
                 <w:sz w:val="18"/>
               </w:rPr>
-              <w:t>Chance Dq 2024 / 2025–26</w:t>
+              <w:t>Hebelkonto 2025–26 (log)</w:t>
             </w:r>
           </w:p>
         </w:tc>
@@ -2112,7 +2271,7 @@
               <w:rPr>
                 <w:sz w:val="18"/>
               </w:rPr>
-              <w:t>+0,1615 / +0,1039</w:t>
+              <w:t>+0,2634</w:t>
             </w:r>
           </w:p>
         </w:tc>
@@ -2130,7 +2289,7 @@
               <w:rPr>
                 <w:sz w:val="18"/>
               </w:rPr>
-              <w:t>– / +0,0774</w:t>
+              <w:t>−0,4877</w:t>
             </w:r>
           </w:p>
         </w:tc>
@@ -2148,7 +2307,7 @@
               <w:rPr>
                 <w:sz w:val="18"/>
               </w:rPr>
-              <w:t>– / +0,0697</w:t>
+              <w:t>−0,4543</w:t>
             </w:r>
           </w:p>
         </w:tc>
@@ -2166,7 +2325,7 @@
               <w:rPr>
                 <w:sz w:val="18"/>
               </w:rPr>
-              <w:t>– / +0,0781</w:t>
+              <w:t>−0,4058</w:t>
             </w:r>
           </w:p>
         </w:tc>
@@ -2186,7 +2345,7 @@
               <w:rPr>
                 <w:sz w:val="18"/>
               </w:rPr>
-              <w:t>Hebelkonto 2025–26 (log)</w:t>
+              <w:t>Rohvorteil je Handel 2025–26</w:t>
             </w:r>
           </w:p>
         </w:tc>
@@ -2204,7 +2363,7 @@
               <w:rPr>
                 <w:sz w:val="18"/>
               </w:rPr>
-              <w:t>+0,2038</w:t>
+              <w:t>+0,583 %</w:t>
             </w:r>
           </w:p>
         </w:tc>
@@ -2222,7 +2381,7 @@
               <w:rPr>
                 <w:sz w:val="18"/>
               </w:rPr>
-              <w:t>−0,4662</w:t>
+              <w:t>+0,324 %</w:t>
             </w:r>
           </w:p>
         </w:tc>
@@ -2240,7 +2399,7 @@
               <w:rPr>
                 <w:sz w:val="18"/>
               </w:rPr>
-              <w:t>−0,4166</w:t>
+              <w:t>+0,331 %</w:t>
             </w:r>
           </w:p>
         </w:tc>
@@ -2258,99 +2417,7 @@
               <w:rPr>
                 <w:sz w:val="18"/>
               </w:rPr>
-              <w:t>−0,3824</w:t>
-            </w:r>
-          </w:p>
-        </w:tc>
-      </w:tr>
-      <w:tr>
-        <w:tc>
-          <w:tcPr>
-            <w:tcW w:type="dxa" w:w="1994"/>
-          </w:tcPr>
-          <w:p>
-            <w:r>
-              <w:rPr>
-                <w:sz w:val="18"/>
-              </w:rPr>
-            </w:r>
-            <w:r>
-              <w:rPr>
-                <w:sz w:val="18"/>
-              </w:rPr>
-              <w:t>Rohvorteil je Handel</w:t>
-            </w:r>
-          </w:p>
-        </w:tc>
-        <w:tc>
-          <w:tcPr>
-            <w:tcW w:type="dxa" w:w="1994"/>
-          </w:tcPr>
-          <w:p>
-            <w:r>
-              <w:rPr>
-                <w:sz w:val="18"/>
-              </w:rPr>
-            </w:r>
-            <w:r>
-              <w:rPr>
-                <w:sz w:val="18"/>
-              </w:rPr>
-              <w:t>+0,573 %</w:t>
-            </w:r>
-          </w:p>
-        </w:tc>
-        <w:tc>
-          <w:tcPr>
-            <w:tcW w:type="dxa" w:w="1994"/>
-          </w:tcPr>
-          <w:p>
-            <w:r>
-              <w:rPr>
-                <w:sz w:val="18"/>
-              </w:rPr>
-            </w:r>
-            <w:r>
-              <w:rPr>
-                <w:sz w:val="18"/>
-              </w:rPr>
-              <w:t>+0,294 %</w:t>
-            </w:r>
-          </w:p>
-        </w:tc>
-        <w:tc>
-          <w:tcPr>
-            <w:tcW w:type="dxa" w:w="1994"/>
-          </w:tcPr>
-          <w:p>
-            <w:r>
-              <w:rPr>
-                <w:sz w:val="18"/>
-              </w:rPr>
-            </w:r>
-            <w:r>
-              <w:rPr>
-                <w:sz w:val="18"/>
-              </w:rPr>
-              <w:t>+0,311 %</w:t>
-            </w:r>
-          </w:p>
-        </w:tc>
-        <w:tc>
-          <w:tcPr>
-            <w:tcW w:type="dxa" w:w="1994"/>
-          </w:tcPr>
-          <w:p>
-            <w:r>
-              <w:rPr>
-                <w:sz w:val="18"/>
-              </w:rPr>
-            </w:r>
-            <w:r>
-              <w:rPr>
-                <w:sz w:val="18"/>
-              </w:rPr>
-              <w:t>+0,309 %</w:t>
+              <w:t>+0,343 %</w:t>
             </w:r>
           </w:p>
         </w:tc>
@@ -2367,7 +2434,7 @@
           <w:color w:val="553388"/>
           <w:sz w:val="18"/>
         </w:rPr>
-        <w:t>messe_losfahren.py --kern --export 0.035 --ruhe 48</w:t>
+        <w:t>messe_losfahren.py --kern --ruhe 48 --junge --export 0.035</w:t>
       </w:r>
       <w:r>
         <w:t xml:space="preserve"> und </w:t>
@@ -2378,10 +2445,531 @@
           <w:color w:val="553388"/>
           <w:sz w:val="18"/>
         </w:rPr>
-        <w:t>messe_k6_hebelstufe.py --kurs mark --einstiege kern48_einstiege_&lt;m&gt;.csv --simulation 24,ohne,0.02</w:t>
+        <w:t>messe_k6_hebelstufe.py --kurs mark --einstiege kern48j_einstiege_&lt;m&gt;.csv --simulation 24,ohne,0.02</w:t>
       </w:r>
       <w:r>
         <w:t>.</w:t>
+      </w:r>
+    </w:p>
+    <w:p>
+      <w:r>
+        <w:rPr>
+          <w:i/>
+        </w:rPr>
+        <w:t xml:space="preserve">Zum Vergleich — die Zahlen </w:t>
+      </w:r>
+      <w:r>
+        <w:rPr>
+          <w:i/>
+        </w:rPr>
+        <w:t>ohne J</w:t>
+      </w:r>
+      <w:r>
+        <w:rPr>
+          <w:i/>
+        </w:rPr>
+        <w:t xml:space="preserve"> (Stand 30.09., nicht mehr gültig als Referenz):</w:t>
+      </w:r>
+    </w:p>
+    <w:tbl>
+      <w:tblPr>
+        <w:tblStyle w:val="LightGrid-Accent1"/>
+        <w:tblW w:type="auto" w:w="0"/>
+        <w:jc w:val="left"/>
+        <w:tblLook w:firstColumn="1" w:firstRow="1" w:lastColumn="0" w:lastRow="0" w:noHBand="0" w:noVBand="1" w:val="04A0"/>
+      </w:tblPr>
+      <w:tblGrid>
+        <w:gridCol w:w="1994"/>
+        <w:gridCol w:w="1994"/>
+        <w:gridCol w:w="1994"/>
+        <w:gridCol w:w="1994"/>
+        <w:gridCol w:w="1994"/>
+      </w:tblGrid>
+      <w:tr>
+        <w:tc>
+          <w:tcPr>
+            <w:tcW w:type="dxa" w:w="1994"/>
+          </w:tcPr>
+          <w:p>
+            <w:r>
+              <w:rPr>
+                <w:sz w:val="18"/>
+              </w:rPr>
+            </w:r>
+          </w:p>
+        </w:tc>
+        <w:tc>
+          <w:tcPr>
+            <w:tcW w:type="dxa" w:w="1994"/>
+          </w:tcPr>
+          <w:p>
+            <w:r>
+              <w:rPr>
+                <w:sz w:val="18"/>
+              </w:rPr>
+            </w:r>
+            <w:r>
+              <w:rPr>
+                <w:b/>
+                <w:sz w:val="18"/>
+              </w:rPr>
+              <w:t>bestand</w:t>
+            </w:r>
+          </w:p>
+        </w:tc>
+        <w:tc>
+          <w:tcPr>
+            <w:tcW w:type="dxa" w:w="1994"/>
+          </w:tcPr>
+          <w:p>
+            <w:r>
+              <w:rPr>
+                <w:sz w:val="18"/>
+              </w:rPr>
+            </w:r>
+            <w:r>
+              <w:rPr>
+                <w:b/>
+                <w:sz w:val="18"/>
+              </w:rPr>
+              <w:t>unverzerrt:1</w:t>
+            </w:r>
+          </w:p>
+        </w:tc>
+        <w:tc>
+          <w:tcPr>
+            <w:tcW w:type="dxa" w:w="1994"/>
+          </w:tcPr>
+          <w:p>
+            <w:r>
+              <w:rPr>
+                <w:sz w:val="18"/>
+              </w:rPr>
+            </w:r>
+            <w:r>
+              <w:rPr>
+                <w:b/>
+                <w:sz w:val="18"/>
+              </w:rPr>
+              <w:t>unverzerrt:2</w:t>
+            </w:r>
+          </w:p>
+        </w:tc>
+        <w:tc>
+          <w:tcPr>
+            <w:tcW w:type="dxa" w:w="1994"/>
+          </w:tcPr>
+          <w:p>
+            <w:r>
+              <w:rPr>
+                <w:sz w:val="18"/>
+              </w:rPr>
+            </w:r>
+            <w:r>
+              <w:rPr>
+                <w:b/>
+                <w:sz w:val="18"/>
+              </w:rPr>
+              <w:t>unverzerrt:3</w:t>
+            </w:r>
+          </w:p>
+        </w:tc>
+      </w:tr>
+      <w:tr>
+        <w:tc>
+          <w:tcPr>
+            <w:tcW w:type="dxa" w:w="1994"/>
+          </w:tcPr>
+          <w:p>
+            <w:r>
+              <w:rPr>
+                <w:sz w:val="18"/>
+              </w:rPr>
+            </w:r>
+            <w:r>
+              <w:rPr>
+                <w:sz w:val="18"/>
+              </w:rPr>
+              <w:t>Einstiege 2024 / 2025–26</w:t>
+            </w:r>
+          </w:p>
+        </w:tc>
+        <w:tc>
+          <w:tcPr>
+            <w:tcW w:type="dxa" w:w="1994"/>
+          </w:tcPr>
+          <w:p>
+            <w:r>
+              <w:rPr>
+                <w:sz w:val="18"/>
+              </w:rPr>
+            </w:r>
+            <w:r>
+              <w:rPr>
+                <w:sz w:val="18"/>
+              </w:rPr>
+              <w:t>1.486 / 6.328</w:t>
+            </w:r>
+          </w:p>
+        </w:tc>
+        <w:tc>
+          <w:tcPr>
+            <w:tcW w:type="dxa" w:w="1994"/>
+          </w:tcPr>
+          <w:p>
+            <w:r>
+              <w:rPr>
+                <w:sz w:val="18"/>
+              </w:rPr>
+            </w:r>
+            <w:r>
+              <w:rPr>
+                <w:sz w:val="18"/>
+              </w:rPr>
+              <w:t>– / 7.121</w:t>
+            </w:r>
+          </w:p>
+        </w:tc>
+        <w:tc>
+          <w:tcPr>
+            <w:tcW w:type="dxa" w:w="1994"/>
+          </w:tcPr>
+          <w:p>
+            <w:r>
+              <w:rPr>
+                <w:sz w:val="18"/>
+              </w:rPr>
+            </w:r>
+            <w:r>
+              <w:rPr>
+                <w:sz w:val="18"/>
+              </w:rPr>
+              <w:t>– / 6.463</w:t>
+            </w:r>
+          </w:p>
+        </w:tc>
+        <w:tc>
+          <w:tcPr>
+            <w:tcW w:type="dxa" w:w="1994"/>
+          </w:tcPr>
+          <w:p>
+            <w:r>
+              <w:rPr>
+                <w:sz w:val="18"/>
+              </w:rPr>
+            </w:r>
+            <w:r>
+              <w:rPr>
+                <w:sz w:val="18"/>
+              </w:rPr>
+              <w:t>– / 6.782</w:t>
+            </w:r>
+          </w:p>
+        </w:tc>
+      </w:tr>
+      <w:tr>
+        <w:tc>
+          <w:tcPr>
+            <w:tcW w:type="dxa" w:w="1994"/>
+          </w:tcPr>
+          <w:p>
+            <w:r>
+              <w:rPr>
+                <w:sz w:val="18"/>
+              </w:rPr>
+            </w:r>
+            <w:r>
+              <w:rPr>
+                <w:sz w:val="18"/>
+              </w:rPr>
+              <w:t>Chance Dq 2024 / 2025–26</w:t>
+            </w:r>
+          </w:p>
+        </w:tc>
+        <w:tc>
+          <w:tcPr>
+            <w:tcW w:type="dxa" w:w="1994"/>
+          </w:tcPr>
+          <w:p>
+            <w:r>
+              <w:rPr>
+                <w:sz w:val="18"/>
+              </w:rPr>
+            </w:r>
+            <w:r>
+              <w:rPr>
+                <w:sz w:val="18"/>
+              </w:rPr>
+              <w:t>+0,1615 / +0,1039</w:t>
+            </w:r>
+          </w:p>
+        </w:tc>
+        <w:tc>
+          <w:tcPr>
+            <w:tcW w:type="dxa" w:w="1994"/>
+          </w:tcPr>
+          <w:p>
+            <w:r>
+              <w:rPr>
+                <w:sz w:val="18"/>
+              </w:rPr>
+            </w:r>
+            <w:r>
+              <w:rPr>
+                <w:sz w:val="18"/>
+              </w:rPr>
+              <w:t>– / +0,0774</w:t>
+            </w:r>
+          </w:p>
+        </w:tc>
+        <w:tc>
+          <w:tcPr>
+            <w:tcW w:type="dxa" w:w="1994"/>
+          </w:tcPr>
+          <w:p>
+            <w:r>
+              <w:rPr>
+                <w:sz w:val="18"/>
+              </w:rPr>
+            </w:r>
+            <w:r>
+              <w:rPr>
+                <w:sz w:val="18"/>
+              </w:rPr>
+              <w:t>– / +0,0697</w:t>
+            </w:r>
+          </w:p>
+        </w:tc>
+        <w:tc>
+          <w:tcPr>
+            <w:tcW w:type="dxa" w:w="1994"/>
+          </w:tcPr>
+          <w:p>
+            <w:r>
+              <w:rPr>
+                <w:sz w:val="18"/>
+              </w:rPr>
+            </w:r>
+            <w:r>
+              <w:rPr>
+                <w:sz w:val="18"/>
+              </w:rPr>
+              <w:t>– / +0,0781</w:t>
+            </w:r>
+          </w:p>
+        </w:tc>
+      </w:tr>
+      <w:tr>
+        <w:tc>
+          <w:tcPr>
+            <w:tcW w:type="dxa" w:w="1994"/>
+          </w:tcPr>
+          <w:p>
+            <w:r>
+              <w:rPr>
+                <w:sz w:val="18"/>
+              </w:rPr>
+            </w:r>
+            <w:r>
+              <w:rPr>
+                <w:sz w:val="18"/>
+              </w:rPr>
+              <w:t>Hebelkonto 2025–26 (log)</w:t>
+            </w:r>
+          </w:p>
+        </w:tc>
+        <w:tc>
+          <w:tcPr>
+            <w:tcW w:type="dxa" w:w="1994"/>
+          </w:tcPr>
+          <w:p>
+            <w:r>
+              <w:rPr>
+                <w:sz w:val="18"/>
+              </w:rPr>
+            </w:r>
+            <w:r>
+              <w:rPr>
+                <w:sz w:val="18"/>
+              </w:rPr>
+              <w:t>+0,2038</w:t>
+            </w:r>
+          </w:p>
+        </w:tc>
+        <w:tc>
+          <w:tcPr>
+            <w:tcW w:type="dxa" w:w="1994"/>
+          </w:tcPr>
+          <w:p>
+            <w:r>
+              <w:rPr>
+                <w:sz w:val="18"/>
+              </w:rPr>
+            </w:r>
+            <w:r>
+              <w:rPr>
+                <w:sz w:val="18"/>
+              </w:rPr>
+              <w:t>−0,4662</w:t>
+            </w:r>
+          </w:p>
+        </w:tc>
+        <w:tc>
+          <w:tcPr>
+            <w:tcW w:type="dxa" w:w="1994"/>
+          </w:tcPr>
+          <w:p>
+            <w:r>
+              <w:rPr>
+                <w:sz w:val="18"/>
+              </w:rPr>
+            </w:r>
+            <w:r>
+              <w:rPr>
+                <w:sz w:val="18"/>
+              </w:rPr>
+              <w:t>−0,4166</w:t>
+            </w:r>
+          </w:p>
+        </w:tc>
+        <w:tc>
+          <w:tcPr>
+            <w:tcW w:type="dxa" w:w="1994"/>
+          </w:tcPr>
+          <w:p>
+            <w:r>
+              <w:rPr>
+                <w:sz w:val="18"/>
+              </w:rPr>
+            </w:r>
+            <w:r>
+              <w:rPr>
+                <w:sz w:val="18"/>
+              </w:rPr>
+              <w:t>−0,3824</w:t>
+            </w:r>
+          </w:p>
+        </w:tc>
+      </w:tr>
+      <w:tr>
+        <w:tc>
+          <w:tcPr>
+            <w:tcW w:type="dxa" w:w="1994"/>
+          </w:tcPr>
+          <w:p>
+            <w:r>
+              <w:rPr>
+                <w:sz w:val="18"/>
+              </w:rPr>
+            </w:r>
+            <w:r>
+              <w:rPr>
+                <w:sz w:val="18"/>
+              </w:rPr>
+              <w:t>Rohvorteil je Handel</w:t>
+            </w:r>
+          </w:p>
+        </w:tc>
+        <w:tc>
+          <w:tcPr>
+            <w:tcW w:type="dxa" w:w="1994"/>
+          </w:tcPr>
+          <w:p>
+            <w:r>
+              <w:rPr>
+                <w:sz w:val="18"/>
+              </w:rPr>
+            </w:r>
+            <w:r>
+              <w:rPr>
+                <w:sz w:val="18"/>
+              </w:rPr>
+              <w:t>+0,573 %</w:t>
+            </w:r>
+          </w:p>
+        </w:tc>
+        <w:tc>
+          <w:tcPr>
+            <w:tcW w:type="dxa" w:w="1994"/>
+          </w:tcPr>
+          <w:p>
+            <w:r>
+              <w:rPr>
+                <w:sz w:val="18"/>
+              </w:rPr>
+            </w:r>
+            <w:r>
+              <w:rPr>
+                <w:sz w:val="18"/>
+              </w:rPr>
+              <w:t>+0,294 %</w:t>
+            </w:r>
+          </w:p>
+        </w:tc>
+        <w:tc>
+          <w:tcPr>
+            <w:tcW w:type="dxa" w:w="1994"/>
+          </w:tcPr>
+          <w:p>
+            <w:r>
+              <w:rPr>
+                <w:sz w:val="18"/>
+              </w:rPr>
+            </w:r>
+            <w:r>
+              <w:rPr>
+                <w:sz w:val="18"/>
+              </w:rPr>
+              <w:t>+0,311 %</w:t>
+            </w:r>
+          </w:p>
+        </w:tc>
+        <w:tc>
+          <w:tcPr>
+            <w:tcW w:type="dxa" w:w="1994"/>
+          </w:tcPr>
+          <w:p>
+            <w:r>
+              <w:rPr>
+                <w:sz w:val="18"/>
+              </w:rPr>
+            </w:r>
+            <w:r>
+              <w:rPr>
+                <w:sz w:val="18"/>
+              </w:rPr>
+              <w:t>+0,309 %</w:t>
+            </w:r>
+          </w:p>
+        </w:tc>
+      </w:tr>
+    </w:tbl>
+    <w:p/>
+    <w:p>
+      <w:r>
+        <w:t xml:space="preserve">(damaliger Aufruf ohne </w:t>
+      </w:r>
+      <w:r>
+        <w:rPr>
+          <w:rFonts w:ascii="Consolas" w:hAnsi="Consolas"/>
+          <w:color w:val="553388"/>
+          <w:sz w:val="18"/>
+        </w:rPr>
+        <w:t>--junge</w:t>
+      </w:r>
+      <w:r>
+        <w:t xml:space="preserve">, </w:t>
+      </w:r>
+      <w:r>
+        <w:rPr>
+          <w:rFonts w:ascii="Consolas" w:hAnsi="Consolas"/>
+          <w:color w:val="553388"/>
+          <w:sz w:val="18"/>
+        </w:rPr>
+        <w:t>kern48_einstiege_&lt;m&gt;.csv</w:t>
+      </w:r>
+      <w:r>
+        <w:t>)</w:t>
       </w:r>
     </w:p>
     <w:p>
@@ -2923,7 +3511,7 @@
         <w:pStyle w:val="Heading2"/>
       </w:pPr>
       <w:r>
-        <w:t>8. ⛔ SHOWSTOPPER vor der Festschreibung — die Mindesthistorie (Nutzer 30.09.)</w:t>
+        <w:t>8. ✔ BEHOBEN (2.698) — war: SHOWSTOPPER vor der Festschreibung, die Mindesthistorie (Nutzer 30.09.)</w:t>
       </w:r>
     </w:p>
     <w:p>
@@ -4057,6 +4645,305 @@
       </w:r>
       <w:r>
         <w:t xml:space="preserve"> (Nutzer-Ja).</w:t>
+      </w:r>
+    </w:p>
+    <w:p>
+      <w:r>
+        <w:rPr>
+          <w:color w:val="AAAAAA"/>
+        </w:rPr>
+        <w:t>____________________________________________________________</w:t>
+      </w:r>
+    </w:p>
+    <w:p>
+      <w:pPr>
+        <w:pStyle w:val="Heading2"/>
+      </w:pPr>
+      <w:r>
+        <w:t>10. ✔ FESTSCHREIBUNG (01.10.2026, E-36)</w:t>
+      </w:r>
+    </w:p>
+    <w:tbl>
+      <w:tblPr>
+        <w:tblStyle w:val="LightGrid-Accent1"/>
+        <w:tblW w:type="auto" w:w="0"/>
+        <w:jc w:val="left"/>
+        <w:tblLook w:firstColumn="1" w:firstRow="1" w:lastColumn="0" w:lastRow="0" w:noHBand="0" w:noVBand="1" w:val="04A0"/>
+      </w:tblPr>
+      <w:tblGrid>
+        <w:gridCol w:w="4986"/>
+        <w:gridCol w:w="4986"/>
+      </w:tblGrid>
+      <w:tr>
+        <w:tc>
+          <w:tcPr>
+            <w:tcW w:type="dxa" w:w="4986"/>
+          </w:tcPr>
+          <w:p>
+            <w:r>
+              <w:rPr>
+                <w:sz w:val="18"/>
+              </w:rPr>
+            </w:r>
+            <w:r>
+              <w:rPr>
+                <w:b/>
+                <w:sz w:val="18"/>
+              </w:rPr>
+              <w:t>Prüfung vor der Festschreibung</w:t>
+            </w:r>
+          </w:p>
+        </w:tc>
+        <w:tc>
+          <w:tcPr>
+            <w:tcW w:type="dxa" w:w="4986"/>
+          </w:tcPr>
+          <w:p>
+            <w:r>
+              <w:rPr>
+                <w:sz w:val="18"/>
+              </w:rPr>
+            </w:r>
+            <w:r>
+              <w:rPr>
+                <w:b/>
+                <w:sz w:val="18"/>
+              </w:rPr>
+              <w:t>Ergebnis</w:t>
+            </w:r>
+          </w:p>
+        </w:tc>
+      </w:tr>
+      <w:tr>
+        <w:tc>
+          <w:tcPr>
+            <w:tcW w:type="dxa" w:w="4986"/>
+          </w:tcPr>
+          <w:p>
+            <w:r>
+              <w:rPr>
+                <w:sz w:val="18"/>
+              </w:rPr>
+            </w:r>
+            <w:r>
+              <w:rPr>
+                <w:sz w:val="18"/>
+              </w:rPr>
+              <w:t>Showstopper Mindesthistorie</w:t>
+            </w:r>
+          </w:p>
+        </w:tc>
+        <w:tc>
+          <w:tcPr>
+            <w:tcW w:type="dxa" w:w="4986"/>
+          </w:tcPr>
+          <w:p>
+            <w:r>
+              <w:rPr>
+                <w:sz w:val="18"/>
+              </w:rPr>
+            </w:r>
+            <w:r>
+              <w:rPr>
+                <w:sz w:val="18"/>
+              </w:rPr>
+              <w:t>✔ behoben mit J (2.698), 4/4 Mengen</w:t>
+            </w:r>
+          </w:p>
+        </w:tc>
+      </w:tr>
+      <w:tr>
+        <w:tc>
+          <w:tcPr>
+            <w:tcW w:type="dxa" w:w="4986"/>
+          </w:tcPr>
+          <w:p>
+            <w:r>
+              <w:rPr>
+                <w:sz w:val="18"/>
+              </w:rPr>
+            </w:r>
+            <w:r>
+              <w:rPr>
+                <w:sz w:val="18"/>
+              </w:rPr>
+              <w:t>Schwellenwahl auf der vollständigen 2024-Menge</w:t>
+            </w:r>
+          </w:p>
+        </w:tc>
+        <w:tc>
+          <w:tcPr>
+            <w:tcW w:type="dxa" w:w="4986"/>
+          </w:tcPr>
+          <w:p>
+            <w:r>
+              <w:rPr>
+                <w:sz w:val="18"/>
+              </w:rPr>
+            </w:r>
+            <w:r>
+              <w:rPr>
+                <w:sz w:val="18"/>
+              </w:rPr>
+              <w:t>✔ wieder s = +0,035 (2.699), Abstand +0,088 gegen +0,066</w:t>
+            </w:r>
+          </w:p>
+        </w:tc>
+      </w:tr>
+      <w:tr>
+        <w:tc>
+          <w:tcPr>
+            <w:tcW w:type="dxa" w:w="4986"/>
+          </w:tcPr>
+          <w:p>
+            <w:r>
+              <w:rPr>
+                <w:sz w:val="18"/>
+              </w:rPr>
+            </w:r>
+            <w:r>
+              <w:rPr>
+                <w:sz w:val="18"/>
+              </w:rPr>
+              <w:t>R-R11 der Referenzzahlen</w:t>
+            </w:r>
+          </w:p>
+        </w:tc>
+        <w:tc>
+          <w:tcPr>
+            <w:tcW w:type="dxa" w:w="4986"/>
+          </w:tcPr>
+          <w:p>
+            <w:r>
+              <w:rPr>
+                <w:sz w:val="18"/>
+              </w:rPr>
+            </w:r>
+            <w:r>
+              <w:rPr>
+                <w:sz w:val="18"/>
+              </w:rPr>
+              <w:t xml:space="preserve">✔ die Zahlen in Abschnitt 5 = Belegdateien (Wache </w:t>
+            </w:r>
+            <w:r>
+              <w:rPr>
+                <w:rFonts w:ascii="Consolas" w:hAnsi="Consolas"/>
+                <w:color w:val="553388"/>
+                <w:sz w:val="18"/>
+              </w:rPr>
+              <w:t>regel0_gegen_belege</w:t>
+            </w:r>
+            <w:r>
+              <w:rPr>
+                <w:sz w:val="18"/>
+              </w:rPr>
+              <w:t>, 0 Abweichungen), mit Gegenprobe</w:t>
+            </w:r>
+          </w:p>
+        </w:tc>
+      </w:tr>
+      <w:tr>
+        <w:tc>
+          <w:tcPr>
+            <w:tcW w:type="dxa" w:w="4986"/>
+          </w:tcPr>
+          <w:p>
+            <w:r>
+              <w:rPr>
+                <w:sz w:val="18"/>
+              </w:rPr>
+            </w:r>
+            <w:r>
+              <w:rPr>
+                <w:sz w:val="18"/>
+              </w:rPr>
+              <w:t>Code</w:t>
+            </w:r>
+          </w:p>
+        </w:tc>
+        <w:tc>
+          <w:tcPr>
+            <w:tcW w:type="dxa" w:w="4986"/>
+          </w:tcPr>
+          <w:p>
+            <w:r>
+              <w:rPr>
+                <w:sz w:val="18"/>
+              </w:rPr>
+            </w:r>
+            <w:r>
+              <w:rPr>
+                <w:sz w:val="18"/>
+              </w:rPr>
+              <w:t xml:space="preserve">✔ </w:t>
+            </w:r>
+            <w:r>
+              <w:rPr>
+                <w:rFonts w:ascii="Consolas" w:hAnsi="Consolas"/>
+                <w:color w:val="553388"/>
+                <w:sz w:val="18"/>
+              </w:rPr>
+              <w:t>hebel_neubau.REGEL0</w:t>
+            </w:r>
+            <w:r>
+              <w:rPr>
+                <w:sz w:val="18"/>
+              </w:rPr>
+              <w:t xml:space="preserve"> mit allen Parametern, Aufruf und Referenz</w:t>
+            </w:r>
+          </w:p>
+        </w:tc>
+      </w:tr>
+    </w:tbl>
+    <w:p/>
+    <w:p>
+      <w:r>
+        <w:t xml:space="preserve">➤ </w:t>
+      </w:r>
+      <w:r>
+        <w:rPr>
+          <w:b/>
+        </w:rPr>
+        <w:t>Ab jetzt:</w:t>
+      </w:r>
+      <w:r>
+        <w:t xml:space="preserve"> Jede Optimierung wird eine </w:t>
+      </w:r>
+      <w:r>
+        <w:rPr>
+          <w:b/>
+        </w:rPr>
+        <w:t>REGEL1 …</w:t>
+      </w:r>
+      <w:r>
+        <w:t xml:space="preserve"> mit Voranalyse, Vorab-Festlegung und der Betriebsprüfung B1–B9 (E-35). Sie reproduziert zuerst REGEL0 (Referenzzahlen Abschnitt 5) und wird nur mit Nutzer-Ja festgeschrieben. Nächste Schritte nach Plan: </w:t>
+      </w:r>
+      <w:r>
+        <w:rPr>
+          <w:b/>
+        </w:rPr>
+        <w:t>4</w:t>
+      </w:r>
+      <w:r>
+        <w:t xml:space="preserve"> Betriebsprüfung am Notebook (Befundaufnahme) · </w:t>
+      </w:r>
+      <w:r>
+        <w:rPr>
+          <w:b/>
+        </w:rPr>
+        <w:t>5</w:t>
+      </w:r>
+      <w:r>
+        <w:t xml:space="preserve"> Messung auf der Hebel-Liste · </w:t>
+      </w:r>
+      <w:r>
+        <w:rPr>
+          <w:b/>
+        </w:rPr>
+        <w:t>6</w:t>
+      </w:r>
+      <w:r>
+        <w:t xml:space="preserve"> REGEL1..n (A, B, R, L, Käuferanteil).</w:t>
       </w:r>
     </w:p>
     <w:sectPr>

</xml_diff>

<commit_message>
2.700 REGEL0 auf der Hebel-Liste: nach Bitpanda-Kosten mit Hebel positiv (x1,23, Rohvorteil +0,87 %, Rueckgang 0,08), die Auswahl traegt (Zufallslisten +0,59 %); Rueckschau-Vorbehalt; KAIA/S ohne gueltigen Markpreis
Co-Authored-By: Claude Opus 5.5 <noreply@anthropic.com>
</commit_message>
<xml_diff>
--- a/Basisinfos/REGEL0_Hebel_Entwurf_30_09.docx
+++ b/Basisinfos/REGEL0_Hebel_Entwurf_30_09.docx
@@ -4653,6 +4653,46 @@
           <w:color w:val="AAAAAA"/>
         </w:rPr>
         <w:t>____________________________________________________________</w:t>
+      </w:r>
+    </w:p>
+    <w:p>
+      <w:pPr>
+        <w:pStyle w:val="Heading2"/>
+      </w:pPr>
+      <w:r>
+        <w:t>10a. Auskunft — REGEL0 auf der Hebel-Liste des Nutzers (2.700)</w:t>
+      </w:r>
+    </w:p>
+    <w:p>
+      <w:r>
+        <w:t xml:space="preserve">Auf den 25 gehandelten Assets der Liste: Hebelkonto </w:t>
+      </w:r>
+      <w:r>
+        <w:rPr>
+          <w:b/>
+        </w:rPr>
+        <w:t>+0,2063 (×1,23)</w:t>
+      </w:r>
+      <w:r>
+        <w:t xml:space="preserve">, beide Jahre positiv, Rohvorteil </w:t>
+      </w:r>
+      <w:r>
+        <w:rPr>
+          <w:b/>
+        </w:rPr>
+        <w:t>+0,87 %</w:t>
+      </w:r>
+      <w:r>
+        <w:t xml:space="preserve"> gegen 0,48 % Kosten, Rückgang 0,083. Die Auswahl trägt: Zufallslisten liegen bei +0,59 %. ⚠️ Rückschau-Vorbehalt, die Liste ist die heutige. Das ist </w:t>
+      </w:r>
+      <w:r>
+        <w:rPr>
+          <w:b/>
+        </w:rPr>
+        <w:t>keine</w:t>
+      </w:r>
+      <w:r>
+        <w:t xml:space="preserve"> neue Referenz, die REGEL0-Referenz bleibt Abschnitt 5.</w:t>
       </w:r>
     </w:p>
     <w:p>

</xml_diff>

<commit_message>
2.701 BTC als Asset: technisch sauber (uebrige bitgleich zur REGEL0), statistisch nicht nachweisbar (~30 Signale je Jahr), wirtschaftlich unschaedlich (Konto um null, keine Liquidation); Nutzerentscheidung offen
Co-Authored-By: Claude Opus 5.5 <noreply@anthropic.com>
</commit_message>
<xml_diff>
--- a/Basisinfos/REGEL0_Hebel_Entwurf_30_09.docx
+++ b/Basisinfos/REGEL0_Hebel_Entwurf_30_09.docx
@@ -4653,6 +4653,48 @@
           <w:color w:val="AAAAAA"/>
         </w:rPr>
         <w:t>____________________________________________________________</w:t>
+      </w:r>
+    </w:p>
+    <w:p>
+      <w:pPr>
+        <w:pStyle w:val="Heading2"/>
+      </w:pPr>
+      <w:r>
+        <w:t>10b. BTC (2.701)</w:t>
+      </w:r>
+    </w:p>
+    <w:p>
+      <w:r>
+        <w:t xml:space="preserve">Mit </w:t>
+      </w:r>
+      <w:r>
+        <w:rPr>
+          <w:rFonts w:ascii="Consolas" w:hAnsi="Consolas"/>
+          <w:color w:val="553388"/>
+          <w:sz w:val="18"/>
+        </w:rPr>
+        <w:t>--mit-btc</w:t>
+      </w:r>
+      <w:r>
+        <w:t xml:space="preserve"> wird BTC zusätzlich ausgewertet, ohne die REGEL0 für die anderen zu ändern (bitgleich). Mit etwa 30 Signalen je Jahr ist BTC </w:t>
+      </w:r>
+      <w:r>
+        <w:rPr>
+          <w:b/>
+        </w:rPr>
+        <w:t>nicht nachweisbar</w:t>
+      </w:r>
+      <w:r>
+        <w:t xml:space="preserve">, aber </w:t>
+      </w:r>
+      <w:r>
+        <w:rPr>
+          <w:b/>
+        </w:rPr>
+        <w:t>unschädlich</w:t>
+      </w:r>
+      <w:r>
+        <w:t xml:space="preserve"> (Konto um null, keine Liquidation). Ob BTC in die handelbare Menge kommt, entscheidet der Nutzer.</w:t>
       </w:r>
     </w:p>
     <w:p>

</xml_diff>

<commit_message>
E-37 BTC in die REGEL0 aufgenommen (Vermerk nicht nachgewiesen, unschaedlich); Referenz und Wache jetzt mit BTC (Belege BTC_01_10), die uebrigen bitgleich
Co-Authored-By: Claude Opus 5.5 <noreply@anthropic.com>
</commit_message>
<xml_diff>
--- a/Basisinfos/REGEL0_Hebel_Entwurf_30_09.docx
+++ b/Basisinfos/REGEL0_Hebel_Entwurf_30_09.docx
@@ -2039,7 +2039,424 @@
         <w:rPr>
           <w:b/>
         </w:rPr>
-        <w:t>✔ GÜLTIG (mit J, 2.698), von der Wache gegen `Basisinfos/J_30_09/sim__&lt;m&gt;.txt` geprüft:</w:t>
+        <w:t>✔ GÜLTIG (mit J und BTC, E-37), von der Wache gegen `Basisinfos/BTC_01_10/sim__&lt;m&gt;.txt` geprüft:</w:t>
+      </w:r>
+    </w:p>
+    <w:tbl>
+      <w:tblPr>
+        <w:tblStyle w:val="LightGrid-Accent1"/>
+        <w:tblW w:type="auto" w:w="0"/>
+        <w:jc w:val="left"/>
+        <w:tblLook w:firstColumn="1" w:firstRow="1" w:lastColumn="0" w:lastRow="0" w:noHBand="0" w:noVBand="1" w:val="04A0"/>
+      </w:tblPr>
+      <w:tblGrid>
+        <w:gridCol w:w="1994"/>
+        <w:gridCol w:w="1994"/>
+        <w:gridCol w:w="1994"/>
+        <w:gridCol w:w="1994"/>
+        <w:gridCol w:w="1994"/>
+      </w:tblGrid>
+      <w:tr>
+        <w:tc>
+          <w:tcPr>
+            <w:tcW w:type="dxa" w:w="1994"/>
+          </w:tcPr>
+          <w:p>
+            <w:r>
+              <w:rPr>
+                <w:sz w:val="18"/>
+              </w:rPr>
+            </w:r>
+          </w:p>
+        </w:tc>
+        <w:tc>
+          <w:tcPr>
+            <w:tcW w:type="dxa" w:w="1994"/>
+          </w:tcPr>
+          <w:p>
+            <w:r>
+              <w:rPr>
+                <w:sz w:val="18"/>
+              </w:rPr>
+            </w:r>
+            <w:r>
+              <w:rPr>
+                <w:b/>
+                <w:sz w:val="18"/>
+              </w:rPr>
+              <w:t>bestand</w:t>
+            </w:r>
+          </w:p>
+        </w:tc>
+        <w:tc>
+          <w:tcPr>
+            <w:tcW w:type="dxa" w:w="1994"/>
+          </w:tcPr>
+          <w:p>
+            <w:r>
+              <w:rPr>
+                <w:sz w:val="18"/>
+              </w:rPr>
+            </w:r>
+            <w:r>
+              <w:rPr>
+                <w:b/>
+                <w:sz w:val="18"/>
+              </w:rPr>
+              <w:t>unverzerrt:1</w:t>
+            </w:r>
+          </w:p>
+        </w:tc>
+        <w:tc>
+          <w:tcPr>
+            <w:tcW w:type="dxa" w:w="1994"/>
+          </w:tcPr>
+          <w:p>
+            <w:r>
+              <w:rPr>
+                <w:sz w:val="18"/>
+              </w:rPr>
+            </w:r>
+            <w:r>
+              <w:rPr>
+                <w:b/>
+                <w:sz w:val="18"/>
+              </w:rPr>
+              <w:t>unverzerrt:2</w:t>
+            </w:r>
+          </w:p>
+        </w:tc>
+        <w:tc>
+          <w:tcPr>
+            <w:tcW w:type="dxa" w:w="1994"/>
+          </w:tcPr>
+          <w:p>
+            <w:r>
+              <w:rPr>
+                <w:sz w:val="18"/>
+              </w:rPr>
+            </w:r>
+            <w:r>
+              <w:rPr>
+                <w:b/>
+                <w:sz w:val="18"/>
+              </w:rPr>
+              <w:t>unverzerrt:3</w:t>
+            </w:r>
+          </w:p>
+        </w:tc>
+      </w:tr>
+      <w:tr>
+        <w:tc>
+          <w:tcPr>
+            <w:tcW w:type="dxa" w:w="1994"/>
+          </w:tcPr>
+          <w:p>
+            <w:r>
+              <w:rPr>
+                <w:sz w:val="18"/>
+              </w:rPr>
+            </w:r>
+            <w:r>
+              <w:rPr>
+                <w:sz w:val="18"/>
+              </w:rPr>
+              <w:t>Einstiege 2024–26 (Export)</w:t>
+            </w:r>
+          </w:p>
+        </w:tc>
+        <w:tc>
+          <w:tcPr>
+            <w:tcW w:type="dxa" w:w="1994"/>
+          </w:tcPr>
+          <w:p>
+            <w:r>
+              <w:rPr>
+                <w:sz w:val="18"/>
+              </w:rPr>
+            </w:r>
+            <w:r>
+              <w:rPr>
+                <w:sz w:val="18"/>
+              </w:rPr>
+              <w:t>10.000</w:t>
+            </w:r>
+          </w:p>
+        </w:tc>
+        <w:tc>
+          <w:tcPr>
+            <w:tcW w:type="dxa" w:w="1994"/>
+          </w:tcPr>
+          <w:p>
+            <w:r>
+              <w:rPr>
+                <w:sz w:val="18"/>
+              </w:rPr>
+            </w:r>
+            <w:r>
+              <w:rPr>
+                <w:sz w:val="18"/>
+              </w:rPr>
+              <w:t>10.429</w:t>
+            </w:r>
+          </w:p>
+        </w:tc>
+        <w:tc>
+          <w:tcPr>
+            <w:tcW w:type="dxa" w:w="1994"/>
+          </w:tcPr>
+          <w:p>
+            <w:r>
+              <w:rPr>
+                <w:sz w:val="18"/>
+              </w:rPr>
+            </w:r>
+            <w:r>
+              <w:rPr>
+                <w:sz w:val="18"/>
+              </w:rPr>
+              <w:t>9.761</w:t>
+            </w:r>
+          </w:p>
+        </w:tc>
+        <w:tc>
+          <w:tcPr>
+            <w:tcW w:type="dxa" w:w="1994"/>
+          </w:tcPr>
+          <w:p>
+            <w:r>
+              <w:rPr>
+                <w:sz w:val="18"/>
+              </w:rPr>
+            </w:r>
+            <w:r>
+              <w:rPr>
+                <w:sz w:val="18"/>
+              </w:rPr>
+              <w:t>10.049</w:t>
+            </w:r>
+          </w:p>
+        </w:tc>
+      </w:tr>
+      <w:tr>
+        <w:tc>
+          <w:tcPr>
+            <w:tcW w:type="dxa" w:w="1994"/>
+          </w:tcPr>
+          <w:p>
+            <w:r>
+              <w:rPr>
+                <w:sz w:val="18"/>
+              </w:rPr>
+            </w:r>
+            <w:r>
+              <w:rPr>
+                <w:sz w:val="18"/>
+              </w:rPr>
+              <w:t>Hebelkonto 2025–26 (log)</w:t>
+            </w:r>
+          </w:p>
+        </w:tc>
+        <w:tc>
+          <w:tcPr>
+            <w:tcW w:type="dxa" w:w="1994"/>
+          </w:tcPr>
+          <w:p>
+            <w:r>
+              <w:rPr>
+                <w:sz w:val="18"/>
+              </w:rPr>
+            </w:r>
+            <w:r>
+              <w:rPr>
+                <w:sz w:val="18"/>
+              </w:rPr>
+              <w:t>+0,2708</w:t>
+            </w:r>
+          </w:p>
+        </w:tc>
+        <w:tc>
+          <w:tcPr>
+            <w:tcW w:type="dxa" w:w="1994"/>
+          </w:tcPr>
+          <w:p>
+            <w:r>
+              <w:rPr>
+                <w:sz w:val="18"/>
+              </w:rPr>
+            </w:r>
+            <w:r>
+              <w:rPr>
+                <w:sz w:val="18"/>
+              </w:rPr>
+              <w:t>−0,4887</w:t>
+            </w:r>
+          </w:p>
+        </w:tc>
+        <w:tc>
+          <w:tcPr>
+            <w:tcW w:type="dxa" w:w="1994"/>
+          </w:tcPr>
+          <w:p>
+            <w:r>
+              <w:rPr>
+                <w:sz w:val="18"/>
+              </w:rPr>
+            </w:r>
+            <w:r>
+              <w:rPr>
+                <w:sz w:val="18"/>
+              </w:rPr>
+              <w:t>−0,4592</w:t>
+            </w:r>
+          </w:p>
+        </w:tc>
+        <w:tc>
+          <w:tcPr>
+            <w:tcW w:type="dxa" w:w="1994"/>
+          </w:tcPr>
+          <w:p>
+            <w:r>
+              <w:rPr>
+                <w:sz w:val="18"/>
+              </w:rPr>
+            </w:r>
+            <w:r>
+              <w:rPr>
+                <w:sz w:val="18"/>
+              </w:rPr>
+              <w:t>−0,4065</w:t>
+            </w:r>
+          </w:p>
+        </w:tc>
+      </w:tr>
+      <w:tr>
+        <w:tc>
+          <w:tcPr>
+            <w:tcW w:type="dxa" w:w="1994"/>
+          </w:tcPr>
+          <w:p>
+            <w:r>
+              <w:rPr>
+                <w:sz w:val="18"/>
+              </w:rPr>
+            </w:r>
+            <w:r>
+              <w:rPr>
+                <w:sz w:val="18"/>
+              </w:rPr>
+              <w:t>Rohvorteil je Handel 2025–26</w:t>
+            </w:r>
+          </w:p>
+        </w:tc>
+        <w:tc>
+          <w:tcPr>
+            <w:tcW w:type="dxa" w:w="1994"/>
+          </w:tcPr>
+          <w:p>
+            <w:r>
+              <w:rPr>
+                <w:sz w:val="18"/>
+              </w:rPr>
+            </w:r>
+            <w:r>
+              <w:rPr>
+                <w:sz w:val="18"/>
+              </w:rPr>
+              <w:t>+0,583 %</w:t>
+            </w:r>
+          </w:p>
+        </w:tc>
+        <w:tc>
+          <w:tcPr>
+            <w:tcW w:type="dxa" w:w="1994"/>
+          </w:tcPr>
+          <w:p>
+            <w:r>
+              <w:rPr>
+                <w:sz w:val="18"/>
+              </w:rPr>
+            </w:r>
+            <w:r>
+              <w:rPr>
+                <w:sz w:val="18"/>
+              </w:rPr>
+              <w:t>+0,325 %</w:t>
+            </w:r>
+          </w:p>
+        </w:tc>
+        <w:tc>
+          <w:tcPr>
+            <w:tcW w:type="dxa" w:w="1994"/>
+          </w:tcPr>
+          <w:p>
+            <w:r>
+              <w:rPr>
+                <w:sz w:val="18"/>
+              </w:rPr>
+            </w:r>
+            <w:r>
+              <w:rPr>
+                <w:sz w:val="18"/>
+              </w:rPr>
+              <w:t>+0,331 %</w:t>
+            </w:r>
+          </w:p>
+        </w:tc>
+        <w:tc>
+          <w:tcPr>
+            <w:tcW w:type="dxa" w:w="1994"/>
+          </w:tcPr>
+          <w:p>
+            <w:r>
+              <w:rPr>
+                <w:sz w:val="18"/>
+              </w:rPr>
+            </w:r>
+            <w:r>
+              <w:rPr>
+                <w:sz w:val="18"/>
+              </w:rPr>
+              <w:t>+0,345 %</w:t>
+            </w:r>
+          </w:p>
+        </w:tc>
+      </w:tr>
+    </w:tbl>
+    <w:p/>
+    <w:p>
+      <w:r>
+        <w:t xml:space="preserve">Aufruf: </w:t>
+      </w:r>
+      <w:r>
+        <w:rPr>
+          <w:rFonts w:ascii="Consolas" w:hAnsi="Consolas"/>
+          <w:color w:val="553388"/>
+          <w:sz w:val="18"/>
+        </w:rPr>
+        <w:t>messe_losfahren.py --kern --ruhe 48 --junge --mit-btc --export 0.035</w:t>
+      </w:r>
+      <w:r>
+        <w:t xml:space="preserve"> und </w:t>
+      </w:r>
+      <w:r>
+        <w:rPr>
+          <w:rFonts w:ascii="Consolas" w:hAnsi="Consolas"/>
+          <w:color w:val="553388"/>
+          <w:sz w:val="18"/>
+        </w:rPr>
+        <w:t>messe_k6_hebelstufe.py --kurs mark --mit-btc --einstiege kern48jb_einstiege_&lt;m&gt;.csv --simulation 24,ohne,0.02</w:t>
+      </w:r>
+      <w:r>
+        <w:t>.</w:t>
+      </w:r>
+    </w:p>
+    <w:p>
+      <w:r>
+        <w:rPr>
+          <w:i/>
+        </w:rPr>
+        <w:t>Ohne BTC (mit J, 2.698), die übrigen Handel sind bitgleich zu oben:</w:t>
       </w:r>
     </w:p>
     <w:tbl>
@@ -4660,7 +5077,7 @@
         <w:pStyle w:val="Heading2"/>
       </w:pPr>
       <w:r>
-        <w:t>10b. BTC (2.701)</w:t>
+        <w:t>10b. BTC (2.701) — ✔ AUFGENOMMEN (Nutzer 01.10., E-37)</w:t>
       </w:r>
     </w:p>
     <w:p>
@@ -4694,7 +5111,22 @@
         <w:t>unschädlich</w:t>
       </w:r>
       <w:r>
-        <w:t xml:space="preserve"> (Konto um null, keine Liquidation). Ob BTC in die handelbare Menge kommt, entscheidet der Nutzer.</w:t>
+        <w:t xml:space="preserve"> (Konto um null, keine Liquidation). ✔ </w:t>
+      </w:r>
+      <w:r>
+        <w:rPr>
+          <w:b/>
+        </w:rPr>
+        <w:t>Nutzer 01.10.: *„Ja, BTC aufnehmen.“</w:t>
+      </w:r>
+      <w:r>
+        <w:rPr>
+          <w:i/>
+        </w:rPr>
+        <w:t xml:space="preserve"> BTC ist handelbar, mit dem Vermerk </w:t>
+      </w:r>
+      <w:r>
+        <w:t>nicht nachgewiesen, unschädlich*. Die Referenz in Abschnitt 5 gilt jetzt mit BTC.</w:t>
       </w:r>
     </w:p>
     <w:p>

</xml_diff>

<commit_message>
E-42: F1 nur Hebel, F2 REGEL0 loest aus, F3 USB-Uebertragung am NB geprueft; REGEL0-Betriebsparameter (Pruefzeitpunkt stuendlich alle Assets, kein eigener Cooldown - Ruhe 48 h, gemessen min 49 h, Median 6,8 Tage) in Dokument und Code; O13 REGEL1-Kandidaten Fortsetzung und Positionsfuehrung/Ausstieg nur echte offene Positionen
Co-Authored-By: Claude Opus 5.5 <noreply@anthropic.com>
</commit_message>
<xml_diff>
--- a/Basisinfos/REGEL0_Hebel_Entwurf_30_09.docx
+++ b/Basisinfos/REGEL0_Hebel_Entwurf_30_09.docx
@@ -921,7 +921,13 @@
           <w:p>
             <w:r/>
             <w:r>
-              <w:t>Zielgröße (Maß)</w:t>
+              <w:rPr>
+                <w:b/>
+              </w:rPr>
+              <w:t>Prüfzeitpunkt</w:t>
+            </w:r>
+            <w:r>
+              <w:t xml:space="preserve"> (Betrieb, 02.10.)</w:t>
             </w:r>
           </w:p>
         </w:tc>
@@ -932,7 +938,22 @@
           <w:p>
             <w:r/>
             <w:r>
-              <w:t>q5: +5 % vor −5 % binnen 24 h, gegen das geschrumpfte Normal</w:t>
+              <w:rPr>
+                <w:b/>
+              </w:rPr>
+              <w:t>jede volle Stunde</w:t>
+            </w:r>
+            <w:r>
+              <w:t xml:space="preserve"> nach Kerzenschluss (UTC), </w:t>
+            </w:r>
+            <w:r>
+              <w:rPr>
+                <w:b/>
+              </w:rPr>
+              <w:t>alle</w:t>
+            </w:r>
+            <w:r>
+              <w:t xml:space="preserve"> Assets. Eine Änderung der Lage sieht das System also spätestens nach einer Stunde</w:t>
             </w:r>
           </w:p>
         </w:tc>
@@ -943,7 +964,172 @@
           <w:p>
             <w:r/>
             <w:r>
+              <w:t>Nutzer 02.10.</w:t>
+            </w:r>
+          </w:p>
+        </w:tc>
+      </w:tr>
+      <w:tr>
+        <w:tc>
+          <w:tcPr>
+            <w:tcW w:type="dxa" w:w="2880"/>
+          </w:tcPr>
+          <w:p>
+            <w:r/>
+            <w:r>
+              <w:rPr>
+                <w:b/>
+              </w:rPr>
+              <w:t>Cooldown</w:t>
+            </w:r>
+            <w:r>
+              <w:t xml:space="preserve"> (Betrieb, 02.10.)</w:t>
+            </w:r>
+          </w:p>
+        </w:tc>
+        <w:tc>
+          <w:tcPr>
+            <w:tcW w:type="dxa" w:w="2880"/>
+          </w:tcPr>
+          <w:p>
+            <w:r/>
+            <w:r>
+              <w:rPr>
+                <w:b/>
+              </w:rPr>
+              <w:t>kein eigener.</w:t>
+            </w:r>
+            <w:r>
+              <w:t xml:space="preserve"> Die Ruhe 48 h wirkt </w:t>
+            </w:r>
+            <w:r>
+              <w:rPr>
+                <w:b/>
+              </w:rPr>
+              <w:t>je Asset</w:t>
+            </w:r>
+            <w:r>
+              <w:t xml:space="preserve">. Gemessen: Zwei Signale desselben Assets liegen mindestens </w:t>
+            </w:r>
+            <w:r>
+              <w:rPr>
+                <w:b/>
+              </w:rPr>
+              <w:t>49 h</w:t>
+            </w:r>
+            <w:r>
+              <w:t xml:space="preserve"> auseinander, im Median </w:t>
+            </w:r>
+            <w:r>
+              <w:rPr>
+                <w:b/>
+              </w:rPr>
+              <w:t>6,8 Tage</w:t>
+            </w:r>
+            <w:r>
+              <w:t xml:space="preserve">. Damit gibt es höchstens </w:t>
+            </w:r>
+            <w:r>
+              <w:rPr>
+                <w:b/>
+              </w:rPr>
+              <w:t>eine</w:t>
+            </w:r>
+            <w:r>
+              <w:t xml:space="preserve"> Position je Asset (Haltedauer 24 h &lt; Ruhe). Andere Assets können in jeder Stunde signalisieren</w:t>
+            </w:r>
+          </w:p>
+        </w:tc>
+        <w:tc>
+          <w:tcPr>
+            <w:tcW w:type="dxa" w:w="2880"/>
+          </w:tcPr>
+          <w:p>
+            <w:r/>
+            <w:r>
+              <w:t>gemessen 02.10.</w:t>
+            </w:r>
+          </w:p>
+        </w:tc>
+      </w:tr>
+      <w:tr>
+        <w:tc>
+          <w:tcPr>
+            <w:tcW w:type="dxa" w:w="2880"/>
+          </w:tcPr>
+          <w:p>
+            <w:r/>
+            <w:r>
+              <w:t>Zielgröße (Maß)</w:t>
+            </w:r>
+          </w:p>
+        </w:tc>
+        <w:tc>
+          <w:tcPr>
+            <w:tcW w:type="dxa" w:w="2880"/>
+          </w:tcPr>
+          <w:p>
+            <w:r/>
+            <w:r>
+              <w:t>q5: +5 % vor −5 % binnen 24 h, gegen das geschrumpfte Normal</w:t>
+            </w:r>
+          </w:p>
+        </w:tc>
+        <w:tc>
+          <w:tcPr>
+            <w:tcW w:type="dxa" w:w="2880"/>
+          </w:tcPr>
+          <w:p>
+            <w:r/>
+            <w:r>
               <w:t>K4</w:t>
+            </w:r>
+          </w:p>
+        </w:tc>
+      </w:tr>
+      <w:tr>
+        <w:tc>
+          <w:tcPr>
+            <w:tcW w:type="dxa" w:w="2880"/>
+          </w:tcPr>
+          <w:p>
+            <w:r/>
+            <w:r>
+              <w:rPr>
+                <w:b/>
+              </w:rPr>
+              <w:t>REGEL1-Kandidat</w:t>
+            </w:r>
+            <w:r>
+              <w:t xml:space="preserve"> (Nutzer 02.10.)</w:t>
+            </w:r>
+          </w:p>
+        </w:tc>
+        <w:tc>
+          <w:tcPr>
+            <w:tcW w:type="dxa" w:w="2880"/>
+          </w:tcPr>
+          <w:p>
+            <w:r/>
+            <w:r>
+              <w:rPr>
+                <w:b/>
+              </w:rPr>
+              <w:t>Fortsetzung</w:t>
+            </w:r>
+            <w:r>
+              <w:t>: ein eigener Einstiegstyp für Assets, die nach dem Signal stark weiterlaufen. Heute ist ein zweiter Einstieg erst nach der Ruhe möglich</w:t>
+            </w:r>
+          </w:p>
+        </w:tc>
+        <w:tc>
+          <w:tcPr>
+            <w:tcW w:type="dxa" w:w="2880"/>
+          </w:tcPr>
+          <w:p>
+            <w:r/>
+            <w:r>
+              <w:t>offen</w:t>
             </w:r>
           </w:p>
         </w:tc>

</xml_diff>

<commit_message>
E-44 Positionsgroesse der REGEL0, Startwerte jederzeit anpassbar: Basisinfos/regel0_betrieb.yaml (Positionswert 1.500 EUR, Einsatz 300-800 EUR nach Hebelstufe, Richtwert 4 gleichzeitig ohne Sperre - bewusst nicht in config.yaml), Rechnung agent/regel0_groesse.py, Wache --paket Regel0Betrieb (prueft Verhalten, nicht Werte; 8/8); Doku Voranalyse 8.5, Plan O15, REGEL0 Paragraf 12. Suite 3142, 4 rot = bekannte Datenstand-Zeilen
Co-Authored-By: Claude Opus 5.5 <noreply@anthropic.com>
</commit_message>
<xml_diff>
--- a/Basisinfos/REGEL0_Hebel_Entwurf_30_09.docx
+++ b/Basisinfos/REGEL0_Hebel_Entwurf_30_09.docx
@@ -4735,6 +4735,78 @@
       </w:tr>
     </w:tbl>
     <w:p/>
+    <w:p>
+      <w:pPr>
+        <w:pStyle w:val="Heading2"/>
+      </w:pPr>
+      <w:r>
+        <w:t>12. Betrieb — Positionsgröße (E-44, 02.10.2026; nicht Teil der Bewertung)</w:t>
+      </w:r>
+    </w:p>
+    <w:p>
+      <w:pPr>
+        <w:jc w:val="left"/>
+      </w:pPr>
+      <w:r>
+        <w:t xml:space="preserve">Die REGEL0 liefert </w:t>
+      </w:r>
+      <w:r>
+        <w:rPr>
+          <w:b/>
+        </w:rPr>
+        <w:t>Signal</w:t>
+      </w:r>
+      <w:r>
+        <w:t xml:space="preserve"> und </w:t>
+      </w:r>
+      <w:r>
+        <w:rPr>
+          <w:b/>
+        </w:rPr>
+        <w:t>Hebelstufe</w:t>
+      </w:r>
+      <w:r>
+        <w:t xml:space="preserve">. Die </w:t>
+      </w:r>
+      <w:r>
+        <w:rPr>
+          <w:b/>
+        </w:rPr>
+        <w:t>Positionsgröße</w:t>
+      </w:r>
+      <w:r>
+        <w:t xml:space="preserve"> ist eine Betriebsfestlegung, die der Nutzer anpasst. Startwerte stehen in </w:t>
+      </w:r>
+      <w:r>
+        <w:rPr>
+          <w:rFonts w:ascii="Consolas" w:hAnsi="Consolas"/>
+          <w:color w:val="882222"/>
+          <w:sz w:val="18"/>
+        </w:rPr>
+        <w:t>Basisinfos/regel0_betrieb.yaml</w:t>
+      </w:r>
+      <w:r>
+        <w:t xml:space="preserve">: Positionswert 1.500 € je Trade, Einsatz = Positionswert / Stufe (5x 300 €, 3x 500 €, 2x 750 €), begrenzt auf 300–800 €, Richtwert 4 gleichzeitig </w:t>
+      </w:r>
+      <w:r>
+        <w:rPr>
+          <w:b/>
+        </w:rPr>
+        <w:t>ohne Sperre</w:t>
+      </w:r>
+      <w:r>
+        <w:t xml:space="preserve">. Die Erfolgsmessung oben (Einsatz 1 % des Kontos) bleibt die </w:t>
+      </w:r>
+      <w:r>
+        <w:rPr>
+          <w:b/>
+        </w:rPr>
+        <w:t>Referenz</w:t>
+      </w:r>
+      <w:r>
+        <w:t xml:space="preserve"> für jede REGELn.</w:t>
+      </w:r>
+    </w:p>
     <w:sectPr>
       <w:pgSz w:w="12240" w:h="15840"/>
       <w:pgMar w:top="1440" w:right="1800" w:bottom="1440" w:left="1800" w:header="720" w:footer="720" w:gutter="0"/>

</xml_diff>

<commit_message>
2.708 REGEL0.1: S7-2 Teil 0 bestanden (E-45 F-a..F-d) - die Schrumpfung griff in der Messung innerhalb des Monats vor; kausale Fassung (Vormonat, messe_losfahren --normal kausal) liefert in bestand, unverzerrt:1, :2 und der Betriebsreferenz kern48jbz bitgleiche Einstiege, unverzerrt:3 98,7 % (alles 2026-01, Rohvorteil +0,350 gegen +0,345 %); Regel 4/4 erfuellt. Nebenbefund: tau2 in 31 von 33 Monaten null - das Normal ist in der Bewertung fast immer die Marktmitte. hebel_neubau.REGEL0 fassung_0_1 + Wache mit Gegenprobe, Belege Basisinfos/Teil0_02_10; Signalkreis = Hebel-Schalter (25/44), O18 Einstiege und Signalanzahl als eigener Punkt, Nebenbefund Migration schaltet neue Watchlist-Assets still an. Suite 3151, 4 rot = bekannte Datenstand-Zeilen
Co-Authored-By: Claude Opus 5.5 <noreply@anthropic.com>
</commit_message>
<xml_diff>
--- a/Basisinfos/REGEL0_Hebel_Entwurf_30_09.docx
+++ b/Basisinfos/REGEL0_Hebel_Entwurf_30_09.docx
@@ -113,6 +113,56 @@
           <w:i/>
         </w:rPr>
         <w:t xml:space="preserve"> ist historisch und bleibt, damit die Verweise gelten. Entstanden als Entwurf am 30.09.2026.</w:t>
+      </w:r>
+    </w:p>
+    <w:p>
+      <w:pPr>
+        <w:ind w:left="360"/>
+      </w:pPr>
+      <w:r>
+        <w:rPr>
+          <w:i/>
+        </w:rPr>
+        <w:t xml:space="preserve">⭐ </w:t>
+      </w:r>
+      <w:r>
+        <w:rPr>
+          <w:b/>
+          <w:i/>
+        </w:rPr>
+        <w:t>Fassung 0.1 seit 02.10.2026</w:t>
+      </w:r>
+      <w:r>
+        <w:rPr>
+          <w:i/>
+        </w:rPr>
+        <w:t xml:space="preserve"> (2.708, Abschnitt 13): dieselbe Regel in </w:t>
+      </w:r>
+      <w:r>
+        <w:rPr>
+          <w:b/>
+          <w:i/>
+        </w:rPr>
+        <w:t>kausaler</w:t>
+      </w:r>
+      <w:r>
+        <w:rPr>
+          <w:i/>
+        </w:rPr>
+        <w:t xml:space="preserve"> Rechenform. Die Einstiege sind in 3 von 4 Mengen und in der Betriebsreferenz </w:t>
+      </w:r>
+      <w:r>
+        <w:rPr>
+          <w:b/>
+          <w:i/>
+        </w:rPr>
+        <w:t>bitgleich</w:t>
+      </w:r>
+      <w:r>
+        <w:rPr>
+          <w:i/>
+        </w:rPr>
+        <w:t>.</w:t>
       </w:r>
     </w:p>
     <w:p>
@@ -762,7 +812,43 @@
               <w:t>QSh</w:t>
             </w:r>
             <w:r>
-              <w:t xml:space="preserve"> = geschrumpftes Normal (stündlich)</w:t>
+              <w:t xml:space="preserve"> = geschrumpftes Normal (stündlich). </w:t>
+            </w:r>
+            <w:r>
+              <w:rPr>
+                <w:b/>
+              </w:rPr>
+              <w:t>Fassung 0.1:</w:t>
+            </w:r>
+            <w:r>
+              <w:t xml:space="preserve"> Marktmitte, τ² und Schrumpfung aus dem </w:t>
+            </w:r>
+            <w:r>
+              <w:rPr>
+                <w:b/>
+              </w:rPr>
+              <w:t>Vormonat</w:t>
+            </w:r>
+            <w:r>
+              <w:t xml:space="preserve"> (kausal). ⚠️ τ² ist in 31 von 33 Monaten </w:t>
+            </w:r>
+            <w:r>
+              <w:rPr>
+                <w:b/>
+              </w:rPr>
+              <w:t>null</w:t>
+            </w:r>
+            <w:r>
+              <w:t xml:space="preserve">: QSh ist damit fast immer die </w:t>
+            </w:r>
+            <w:r>
+              <w:rPr>
+                <w:b/>
+              </w:rPr>
+              <w:t>Marktmitte</w:t>
+            </w:r>
+            <w:r>
+              <w:t xml:space="preserve"> des Monats</w:t>
             </w:r>
           </w:p>
         </w:tc>
@@ -773,7 +859,13 @@
           <w:p>
             <w:r/>
             <w:r>
-              <w:t>2.684</w:t>
+              <w:t xml:space="preserve">2.684, </w:t>
+            </w:r>
+            <w:r>
+              <w:rPr>
+                <w:b/>
+              </w:rPr>
+              <w:t>2.708</w:t>
             </w:r>
           </w:p>
         </w:tc>
@@ -4805,6 +4897,579 @@
       </w:r>
       <w:r>
         <w:t xml:space="preserve"> für jede REGELn.</w:t>
+      </w:r>
+    </w:p>
+    <w:p>
+      <w:pPr>
+        <w:pStyle w:val="Heading2"/>
+      </w:pPr>
+      <w:r>
+        <w:t>13. Fassung 0.1 — die Schrumpfung kausal (2.708, 02.10.2026)</w:t>
+      </w:r>
+    </w:p>
+    <w:p>
+      <w:pPr>
+        <w:jc w:val="left"/>
+      </w:pPr>
+      <w:r>
+        <w:rPr>
+          <w:b/>
+        </w:rPr>
+        <w:t>Anlass (Schritt 7, S7-2, B-1):</w:t>
+      </w:r>
+      <w:r>
+        <w:t xml:space="preserve"> Die Messung nahm Marktmitte, τ² und Schrumpfungsfaktor je Asset aus </w:t>
+      </w:r>
+      <w:r>
+        <w:rPr>
+          <w:b/>
+        </w:rPr>
+        <w:t>allen</w:t>
+      </w:r>
+      <w:r>
+        <w:t xml:space="preserve"> Gitterstunden des </w:t>
+      </w:r>
+      <w:r>
+        <w:rPr>
+          <w:b/>
+        </w:rPr>
+        <w:t>laufenden</w:t>
+      </w:r>
+      <w:r>
+        <w:t xml:space="preserve"> Monats. Eine Stunde am 10. nutzte also Werte vom 11. bis zum 31. Das ist ein Vorgriff, und im Betrieb ist es nicht nachbaubar.</w:t>
+      </w:r>
+    </w:p>
+    <w:p>
+      <w:pPr>
+        <w:jc w:val="left"/>
+      </w:pPr>
+      <w:r>
+        <w:rPr>
+          <w:b/>
+        </w:rPr>
+        <w:t>Fassung 0.1:</w:t>
+      </w:r>
+      <w:r>
+        <w:t xml:space="preserve"> Diese Größen kommen aus dem </w:t>
+      </w:r>
+      <w:r>
+        <w:rPr>
+          <w:b/>
+        </w:rPr>
+        <w:t>Vormonat</w:t>
+      </w:r>
+      <w:r>
+        <w:t xml:space="preserve">. Ein Asset ohne Vormonat (jung, BTC, neu) nimmt seine Gitterstunden des laufenden Monats </w:t>
+      </w:r>
+      <w:r>
+        <w:rPr>
+          <w:b/>
+        </w:rPr>
+        <w:t>bis zur Stunde t</w:t>
+      </w:r>
+      <w:r>
+        <w:t xml:space="preserve">. Aufruf mit </w:t>
+      </w:r>
+      <w:r>
+        <w:rPr>
+          <w:rFonts w:ascii="Consolas" w:hAnsi="Consolas"/>
+          <w:color w:val="882222"/>
+          <w:sz w:val="18"/>
+        </w:rPr>
+        <w:t>--normal kausal</w:t>
+      </w:r>
+      <w:r>
+        <w:t xml:space="preserve">, im Code </w:t>
+      </w:r>
+      <w:r>
+        <w:rPr>
+          <w:rFonts w:ascii="Consolas" w:hAnsi="Consolas"/>
+          <w:color w:val="882222"/>
+          <w:sz w:val="18"/>
+        </w:rPr>
+        <w:t>hebel_neubau.REGEL0["fassung_0_1"]</w:t>
+      </w:r>
+      <w:r>
+        <w:t>.</w:t>
+      </w:r>
+    </w:p>
+    <w:p>
+      <w:pPr>
+        <w:jc w:val="left"/>
+      </w:pPr>
+      <w:r>
+        <w:rPr>
+          <w:b/>
+        </w:rPr>
+        <w:t>Teil 0</w:t>
+      </w:r>
+      <w:r>
+        <w:t xml:space="preserve"> (Regel vorab, E-45; Beleg </w:t>
+      </w:r>
+      <w:r>
+        <w:rPr>
+          <w:rFonts w:ascii="Consolas" w:hAnsi="Consolas"/>
+          <w:color w:val="882222"/>
+          <w:sz w:val="18"/>
+        </w:rPr>
+        <w:t>Basisinfos/Teil0_02_10/ergebnis_teil0.txt</w:t>
+      </w:r>
+      <w:r>
+        <w:t>):</w:t>
+      </w:r>
+    </w:p>
+    <w:tbl>
+      <w:tblPr>
+        <w:tblStyle w:val="LightGrid-Accent1"/>
+        <w:tblW w:type="auto" w:w="0"/>
+        <w:jc w:val="left"/>
+        <w:tblLook w:firstColumn="1" w:firstRow="1" w:lastColumn="0" w:lastRow="0" w:noHBand="0" w:noVBand="1" w:val="04A0"/>
+      </w:tblPr>
+      <w:tblGrid>
+        <w:gridCol w:w="2160"/>
+        <w:gridCol w:w="2160"/>
+        <w:gridCol w:w="2160"/>
+        <w:gridCol w:w="2160"/>
+      </w:tblGrid>
+      <w:tr>
+        <w:tc>
+          <w:tcPr>
+            <w:tcW w:type="dxa" w:w="2160"/>
+          </w:tcPr>
+          <w:p>
+            <w:r>
+              <w:rPr>
+                <w:b/>
+              </w:rPr>
+            </w:r>
+            <w:r>
+              <w:rPr>
+                <w:b/>
+              </w:rPr>
+              <w:t>Menge</w:t>
+            </w:r>
+          </w:p>
+        </w:tc>
+        <w:tc>
+          <w:tcPr>
+            <w:tcW w:type="dxa" w:w="2160"/>
+          </w:tcPr>
+          <w:p>
+            <w:r>
+              <w:rPr>
+                <w:b/>
+              </w:rPr>
+            </w:r>
+            <w:r>
+              <w:rPr>
+                <w:b/>
+              </w:rPr>
+              <w:t>Einstiege gleich</w:t>
+            </w:r>
+          </w:p>
+        </w:tc>
+        <w:tc>
+          <w:tcPr>
+            <w:tcW w:type="dxa" w:w="2160"/>
+          </w:tcPr>
+          <w:p>
+            <w:r>
+              <w:rPr>
+                <w:b/>
+              </w:rPr>
+            </w:r>
+            <w:r>
+              <w:rPr>
+                <w:b/>
+              </w:rPr>
+              <w:t>Rohvorteil je Handel</w:t>
+            </w:r>
+          </w:p>
+        </w:tc>
+        <w:tc>
+          <w:tcPr>
+            <w:tcW w:type="dxa" w:w="2160"/>
+          </w:tcPr>
+          <w:p>
+            <w:r>
+              <w:rPr>
+                <w:b/>
+              </w:rPr>
+            </w:r>
+            <w:r>
+              <w:rPr>
+                <w:b/>
+              </w:rPr>
+              <w:t>Konto</w:t>
+            </w:r>
+          </w:p>
+        </w:tc>
+      </w:tr>
+      <w:tr>
+        <w:tc>
+          <w:tcPr>
+            <w:tcW w:type="dxa" w:w="2160"/>
+          </w:tcPr>
+          <w:p>
+            <w:r/>
+            <w:r>
+              <w:t>bestand</w:t>
+            </w:r>
+          </w:p>
+        </w:tc>
+        <w:tc>
+          <w:tcPr>
+            <w:tcW w:type="dxa" w:w="2160"/>
+          </w:tcPr>
+          <w:p>
+            <w:r/>
+            <w:r>
+              <w:rPr>
+                <w:b/>
+              </w:rPr>
+              <w:t>bitgleich</w:t>
+            </w:r>
+            <w:r>
+              <w:t xml:space="preserve"> (10.000)</w:t>
+            </w:r>
+          </w:p>
+        </w:tc>
+        <w:tc>
+          <w:tcPr>
+            <w:tcW w:type="dxa" w:w="2160"/>
+          </w:tcPr>
+          <w:p>
+            <w:r/>
+            <w:r>
+              <w:t>unverändert +0,583 %</w:t>
+            </w:r>
+          </w:p>
+        </w:tc>
+        <w:tc>
+          <w:tcPr>
+            <w:tcW w:type="dxa" w:w="2160"/>
+          </w:tcPr>
+          <w:p>
+            <w:r/>
+            <w:r>
+              <w:t>unverändert</w:t>
+            </w:r>
+          </w:p>
+        </w:tc>
+      </w:tr>
+      <w:tr>
+        <w:tc>
+          <w:tcPr>
+            <w:tcW w:type="dxa" w:w="2160"/>
+          </w:tcPr>
+          <w:p>
+            <w:r/>
+            <w:r>
+              <w:t>unverzerrt:1 · :2</w:t>
+            </w:r>
+          </w:p>
+        </w:tc>
+        <w:tc>
+          <w:tcPr>
+            <w:tcW w:type="dxa" w:w="2160"/>
+          </w:tcPr>
+          <w:p>
+            <w:r/>
+            <w:r>
+              <w:rPr>
+                <w:b/>
+              </w:rPr>
+              <w:t>bitgleich</w:t>
+            </w:r>
+          </w:p>
+        </w:tc>
+        <w:tc>
+          <w:tcPr>
+            <w:tcW w:type="dxa" w:w="2160"/>
+          </w:tcPr>
+          <w:p>
+            <w:r/>
+            <w:r>
+              <w:t>unverändert</w:t>
+            </w:r>
+          </w:p>
+        </w:tc>
+        <w:tc>
+          <w:tcPr>
+            <w:tcW w:type="dxa" w:w="2160"/>
+          </w:tcPr>
+          <w:p>
+            <w:r/>
+            <w:r>
+              <w:t>unverändert</w:t>
+            </w:r>
+          </w:p>
+        </w:tc>
+      </w:tr>
+      <w:tr>
+        <w:tc>
+          <w:tcPr>
+            <w:tcW w:type="dxa" w:w="2160"/>
+          </w:tcPr>
+          <w:p>
+            <w:r/>
+            <w:r>
+              <w:t>unverzerrt:3</w:t>
+            </w:r>
+          </w:p>
+        </w:tc>
+        <w:tc>
+          <w:tcPr>
+            <w:tcW w:type="dxa" w:w="2160"/>
+          </w:tcPr>
+          <w:p>
+            <w:r/>
+            <w:r>
+              <w:t xml:space="preserve">98,7 % (161 Abweichungen, </w:t>
+            </w:r>
+            <w:r>
+              <w:rPr>
+                <w:b/>
+              </w:rPr>
+              <w:t>alle im Januar 2026</w:t>
+            </w:r>
+            <w:r>
+              <w:t>, 85 Assets)</w:t>
+            </w:r>
+          </w:p>
+        </w:tc>
+        <w:tc>
+          <w:tcPr>
+            <w:tcW w:type="dxa" w:w="2160"/>
+          </w:tcPr>
+          <w:p>
+            <w:r/>
+            <w:r>
+              <w:rPr>
+                <w:b/>
+              </w:rPr>
+              <w:t>+0,350 %</w:t>
+            </w:r>
+            <w:r>
+              <w:t xml:space="preserve"> statt +0,345 %</w:t>
+            </w:r>
+          </w:p>
+        </w:tc>
+        <w:tc>
+          <w:tcPr>
+            <w:tcW w:type="dxa" w:w="2160"/>
+          </w:tcPr>
+          <w:p>
+            <w:r/>
+            <w:r>
+              <w:t>−0,384 statt −0,407</w:t>
+            </w:r>
+          </w:p>
+        </w:tc>
+      </w:tr>
+      <w:tr>
+        <w:tc>
+          <w:tcPr>
+            <w:tcW w:type="dxa" w:w="2160"/>
+          </w:tcPr>
+          <w:p>
+            <w:r/>
+            <w:r>
+              <w:rPr>
+                <w:b/>
+              </w:rPr>
+              <w:t>Betriebsreferenz</w:t>
+            </w:r>
+            <w:r>
+              <w:t xml:space="preserve"> (mit den Zusatz-Assets deiner Listen, 127 Assets)</w:t>
+            </w:r>
+          </w:p>
+        </w:tc>
+        <w:tc>
+          <w:tcPr>
+            <w:tcW w:type="dxa" w:w="2160"/>
+          </w:tcPr>
+          <w:p>
+            <w:r/>
+            <w:r>
+              <w:rPr>
+                <w:b/>
+              </w:rPr>
+              <w:t>bitgleich</w:t>
+            </w:r>
+            <w:r>
+              <w:t xml:space="preserve"> (10.732)</w:t>
+            </w:r>
+          </w:p>
+        </w:tc>
+        <w:tc>
+          <w:tcPr>
+            <w:tcW w:type="dxa" w:w="2160"/>
+          </w:tcPr>
+          <w:p>
+            <w:r/>
+            <w:r>
+              <w:t>—</w:t>
+            </w:r>
+          </w:p>
+        </w:tc>
+        <w:tc>
+          <w:tcPr>
+            <w:tcW w:type="dxa" w:w="2160"/>
+          </w:tcPr>
+          <w:p>
+            <w:r/>
+            <w:r>
+              <w:t>—</w:t>
+            </w:r>
+          </w:p>
+        </w:tc>
+      </w:tr>
+    </w:tbl>
+    <w:p/>
+    <w:p>
+      <w:pPr>
+        <w:jc w:val="left"/>
+      </w:pPr>
+      <w:r>
+        <w:t xml:space="preserve">→ 4 von 4 Mengen erfüllen die Regel. </w:t>
+      </w:r>
+      <w:r>
+        <w:rPr>
+          <w:b/>
+        </w:rPr>
+        <w:t>Fassung 0.1 gilt</w:t>
+      </w:r>
+      <w:r>
+        <w:t xml:space="preserve">, und der Betrieb rechnet sie. Die Referenzzahlen in Abschnitt 5 gelten für bestand, unverzerrt:1 und :2 unverändert. unverzerrt:3 hat in Fassung 0.1 die Referenz 9.958 Einstiege, Konto −0,3840, Rohvorteil +0,350 %. Die Signalbilanz je Asset ist </w:t>
+      </w:r>
+      <w:r>
+        <w:rPr>
+          <w:b/>
+        </w:rPr>
+        <w:t>unverändert</w:t>
+      </w:r>
+      <w:r>
+        <w:t>.</w:t>
+      </w:r>
+    </w:p>
+    <w:p>
+      <w:pPr>
+        <w:jc w:val="left"/>
+      </w:pPr>
+      <w:r>
+        <w:rPr>
+          <w:b/>
+        </w:rPr>
+        <w:t>Warum so klein:</w:t>
+      </w:r>
+      <w:r>
+        <w:t xml:space="preserve"> v̂ ist der Vorsprung </w:t>
+      </w:r>
+      <w:r>
+        <w:rPr>
+          <w:b/>
+        </w:rPr>
+        <w:t>gegen</w:t>
+      </w:r>
+      <w:r>
+        <w:t xml:space="preserve"> das Normal. Eine Verschiebung des Normals hebt sich bei q um 0,47 fast vollständig auf: |ΔQSh| im Median 0,005,</w:t>
+      </w:r>
+    </w:p>
+    <w:p>
+      <w:pPr>
+        <w:jc w:val="left"/>
+      </w:pPr>
+      <w:r>
+        <w:t>|Δv̂| im Median 0,0000075.</w:t>
+      </w:r>
+    </w:p>
+    <w:p>
+      <w:pPr>
+        <w:jc w:val="left"/>
+      </w:pPr>
+      <w:r>
+        <w:t xml:space="preserve">⭐⭐ </w:t>
+      </w:r>
+      <w:r>
+        <w:rPr>
+          <w:b/>
+        </w:rPr>
+        <w:t>Nebenbefund:</w:t>
+      </w:r>
+      <w:r>
+        <w:t xml:space="preserve"> τ² ist in </w:t>
+      </w:r>
+      <w:r>
+        <w:rPr>
+          <w:b/>
+        </w:rPr>
+        <w:t>31 von 33 Monaten null</w:t>
+      </w:r>
+      <w:r>
+        <w:t xml:space="preserve">, in bestand wie in unverzerrt:3 und in beiden Fassungen. Das geschrumpfte Normal ist damit in der Bewertung fast immer die </w:t>
+      </w:r>
+      <w:r>
+        <w:rPr>
+          <w:b/>
+        </w:rPr>
+        <w:t>Marktmitte</w:t>
+      </w:r>
+      <w:r>
+        <w:t xml:space="preserve"> des Monats. Das eigene Normal eines Assets wirkt nur noch über den Offset im </w:t>
+      </w:r>
+      <w:r>
+        <w:rPr>
+          <w:b/>
+        </w:rPr>
+        <w:t>Training</w:t>
+      </w:r>
+      <w:r>
+        <w:t>. Das passt zu 2.683 (</w:t>
+      </w:r>
+      <w:r>
+        <w:rPr>
+          <w:i/>
+        </w:rPr>
+        <w:t>das Normal ist meist Rauschen</w:t>
+      </w:r>
+      <w:r>
+        <w:t xml:space="preserve">). Die Beschreibung </w:t>
+      </w:r>
+      <w:r>
+        <w:rPr>
+          <w:i/>
+        </w:rPr>
+        <w:t>Vorsprung gegen die eigene Phase</w:t>
+      </w:r>
+      <w:r>
+        <w:t xml:space="preserve"> trifft für die Bewertung also nicht zu: Es ist ein Vorsprung gegen die </w:t>
+      </w:r>
+      <w:r>
+        <w:rPr>
+          <w:b/>
+        </w:rPr>
+        <w:t>Marktmitte</w:t>
+      </w:r>
+      <w:r>
+        <w:t>.</w:t>
+      </w:r>
+    </w:p>
+    <w:p>
+      <w:pPr>
+        <w:jc w:val="left"/>
+      </w:pPr>
+      <w:r>
+        <w:t xml:space="preserve">⚠️ Offen und </w:t>
+      </w:r>
+      <w:r>
+        <w:rPr>
+          <w:b/>
+        </w:rPr>
+        <w:t>nicht geklärt:</w:t>
+      </w:r>
+      <w:r>
+        <w:t xml:space="preserve"> Warum in unverzerrt:3 gerade der Januar 2026 die Schwelle anders sieht (674 Stunden).</w:t>
       </w:r>
     </w:p>
     <w:sectPr>

</xml_diff>